<commit_message>
Update Project Doku, Notebook, Dashboard
</commit_message>
<xml_diff>
--- a/report/Marketing KPI Analysis – Project Documentation.docx
+++ b/report/Marketing KPI Analysis – Project Documentation.docx
@@ -4,7 +4,7 @@
   <w:body>
     <w:p>
       <w:pPr>
-        <w:pStyle w:val="Heading1"/>
+        <w:pStyle w:val="berschrift1"/>
         <w:jc w:val="center"/>
       </w:pPr>
       <w:r>
@@ -79,7 +79,7 @@
     </w:p>
     <w:p>
       <w:pPr>
-        <w:pStyle w:val="Heading2"/>
+        <w:pStyle w:val="berschrift2"/>
       </w:pPr>
       <w:r>
         <w:t>1. Objective</w:t>
@@ -133,7 +133,7 @@
     </w:p>
     <w:p>
       <w:pPr>
-        <w:pStyle w:val="Heading2"/>
+        <w:pStyle w:val="berschrift2"/>
       </w:pPr>
       <w:r>
         <w:t>2. Data Basis and Context</w:t>
@@ -168,7 +168,7 @@
     </w:p>
     <w:tbl>
       <w:tblPr>
-        <w:tblStyle w:val="TableGrid"/>
+        <w:tblStyle w:val="Tabellenraster"/>
         <w:tblW w:w="0" w:type="auto"/>
         <w:tblLook w:val="04A0" w:firstRow="1" w:lastRow="0" w:firstColumn="1" w:lastColumn="0" w:noHBand="0" w:noVBand="1"/>
       </w:tblPr>
@@ -641,7 +641,7 @@
     <w:p/>
     <w:p>
       <w:pPr>
-        <w:pStyle w:val="Heading2"/>
+        <w:pStyle w:val="berschrift2"/>
       </w:pPr>
       <w:r>
         <w:t>3. Data Cleaning</w:t>
@@ -654,13 +654,13 @@
     </w:p>
     <w:tbl>
       <w:tblPr>
-        <w:tblStyle w:val="TableGrid"/>
+        <w:tblStyle w:val="Tabellenraster"/>
         <w:tblW w:w="0" w:type="auto"/>
         <w:tblLook w:val="04A0" w:firstRow="1" w:lastRow="0" w:firstColumn="1" w:lastColumn="0" w:noHBand="0" w:noVBand="1"/>
       </w:tblPr>
       <w:tblGrid>
-        <w:gridCol w:w="4316"/>
-        <w:gridCol w:w="4314"/>
+        <w:gridCol w:w="4315"/>
+        <w:gridCol w:w="4315"/>
       </w:tblGrid>
       <w:tr>
         <w:tc>
@@ -960,113 +960,7 @@
               <w:spacing w:after="200" w:line="276" w:lineRule="auto"/>
             </w:pPr>
             <w:r>
-              <w:t xml:space="preserve">Split address </w:t>
-            </w:r>
-            <w:proofErr w:type="spellStart"/>
-            <w:r>
-              <w:t>i</w:t>
-            </w:r>
-            <w:proofErr w:type="spellEnd"/>
-          </w:p>
-          <w:tbl>
-            <w:tblPr>
-              <w:tblW w:w="0" w:type="auto"/>
-              <w:tblCellSpacing w:w="15" w:type="dxa"/>
-              <w:tblCellMar>
-                <w:top w:w="15" w:type="dxa"/>
-                <w:left w:w="15" w:type="dxa"/>
-                <w:bottom w:w="15" w:type="dxa"/>
-                <w:right w:w="15" w:type="dxa"/>
-              </w:tblCellMar>
-              <w:tblLook w:val="04A0" w:firstRow="1" w:lastRow="0" w:firstColumn="1" w:lastColumn="0" w:noHBand="0" w:noVBand="1"/>
-            </w:tblPr>
-            <w:tblGrid>
-              <w:gridCol w:w="2865"/>
-            </w:tblGrid>
-            <w:tr>
-              <w:trPr>
-                <w:tblCellSpacing w:w="15" w:type="dxa"/>
-              </w:trPr>
-              <w:tc>
-                <w:tcPr>
-                  <w:tcW w:w="0" w:type="auto"/>
-                  <w:vAlign w:val="center"/>
-                  <w:hideMark/>
-                </w:tcPr>
-                <w:p>
-                  <w:pPr>
-                    <w:rPr>
-                      <w:lang w:val="en-GB"/>
-                    </w:rPr>
-                  </w:pPr>
-                  <w:r>
-                    <w:rPr>
-                      <w:lang w:val="en-GB"/>
-                    </w:rPr>
-                    <w:t>Standardized phone numbers</w:t>
-                  </w:r>
-                </w:p>
-              </w:tc>
-            </w:tr>
-          </w:tbl>
-          <w:p>
-            <w:pPr>
-              <w:spacing w:after="200" w:line="276" w:lineRule="auto"/>
-              <w:rPr>
-                <w:vanish/>
-                <w:lang w:val="en-GB"/>
-              </w:rPr>
-            </w:pPr>
-          </w:p>
-          <w:tbl>
-            <w:tblPr>
-              <w:tblW w:w="0" w:type="auto"/>
-              <w:tblCellSpacing w:w="15" w:type="dxa"/>
-              <w:tblCellMar>
-                <w:top w:w="15" w:type="dxa"/>
-                <w:left w:w="15" w:type="dxa"/>
-                <w:bottom w:w="15" w:type="dxa"/>
-                <w:right w:w="15" w:type="dxa"/>
-              </w:tblCellMar>
-              <w:tblLook w:val="04A0" w:firstRow="1" w:lastRow="0" w:firstColumn="1" w:lastColumn="0" w:noHBand="0" w:noVBand="1"/>
-            </w:tblPr>
-            <w:tblGrid>
-              <w:gridCol w:w="96"/>
-            </w:tblGrid>
-            <w:tr>
-              <w:trPr>
-                <w:tblCellSpacing w:w="15" w:type="dxa"/>
-              </w:trPr>
-              <w:tc>
-                <w:tcPr>
-                  <w:tcW w:w="0" w:type="auto"/>
-                  <w:vAlign w:val="center"/>
-                  <w:hideMark/>
-                </w:tcPr>
-                <w:p>
-                  <w:pPr>
-                    <w:rPr>
-                      <w:lang w:val="en-GB"/>
-                    </w:rPr>
-                  </w:pPr>
-                </w:p>
-              </w:tc>
-            </w:tr>
-          </w:tbl>
-          <w:p>
-            <w:pPr>
-              <w:spacing w:after="200" w:line="276" w:lineRule="auto"/>
-            </w:pPr>
-            <w:r>
-              <w:t xml:space="preserve"> </w:t>
-            </w:r>
-            <w:proofErr w:type="spellStart"/>
-            <w:r>
-              <w:t>nto</w:t>
-            </w:r>
-            <w:proofErr w:type="spellEnd"/>
-            <w:r>
-              <w:t xml:space="preserve"> parts</w:t>
+              <w:t>Split address</w:t>
             </w:r>
           </w:p>
         </w:tc>
@@ -1105,21 +999,16 @@
           </w:tcPr>
           <w:p>
             <w:pPr>
-              <w:spacing w:after="200" w:line="276" w:lineRule="auto"/>
+              <w:rPr>
+                <w:lang w:val="en-GB"/>
+              </w:rPr>
             </w:pPr>
-            <w:proofErr w:type="spellStart"/>
             <w:r>
-              <w:t>Vereinheitlichung</w:t>
+              <w:rPr>
+                <w:lang w:val="en-GB"/>
+              </w:rPr>
+              <w:t>Standardized phone numbers</w:t>
             </w:r>
-            <w:proofErr w:type="spellEnd"/>
-            <w:r>
-              <w:t xml:space="preserve"> von </w:t>
-            </w:r>
-            <w:proofErr w:type="spellStart"/>
-            <w:r>
-              <w:t>Telefonnummern</w:t>
-            </w:r>
-            <w:proofErr w:type="spellEnd"/>
           </w:p>
         </w:tc>
         <w:tc>
@@ -1289,7 +1178,7 @@
     </w:p>
     <w:p>
       <w:pPr>
-        <w:pStyle w:val="Heading2"/>
+        <w:pStyle w:val="berschrift2"/>
       </w:pPr>
       <w:r>
         <w:t>4. Feature Engineering</w:t>
@@ -1302,7 +1191,7 @@
     </w:p>
     <w:tbl>
       <w:tblPr>
-        <w:tblStyle w:val="TableGrid"/>
+        <w:tblStyle w:val="Tabellenraster"/>
         <w:tblW w:w="0" w:type="auto"/>
         <w:tblLook w:val="04A0" w:firstRow="1" w:lastRow="0" w:firstColumn="1" w:lastColumn="0" w:noHBand="0" w:noVBand="1"/>
       </w:tblPr>
@@ -1336,7 +1225,6 @@
                 <w:b/>
                 <w:bCs/>
               </w:rPr>
-              <w:lastRenderedPageBreak/>
               <w:t>KPI</w:t>
             </w:r>
           </w:p>
@@ -1415,6 +1303,7 @@
               <w:spacing w:after="200" w:line="276" w:lineRule="auto"/>
             </w:pPr>
             <w:r>
+              <w:lastRenderedPageBreak/>
               <w:t>ER (Engagement Rate)</w:t>
             </w:r>
           </w:p>
@@ -2091,7 +1980,7 @@
     </w:p>
     <w:p>
       <w:pPr>
-        <w:pStyle w:val="Heading2"/>
+        <w:pStyle w:val="berschrift2"/>
       </w:pPr>
       <w:r>
         <w:t>5.1 Artificial Weighting Using Random Forest</w:t>
@@ -2277,7 +2166,7 @@
     </w:p>
     <w:p>
       <w:pPr>
-        <w:pStyle w:val="Heading2"/>
+        <w:pStyle w:val="berschrift2"/>
       </w:pPr>
       <w:r>
         <w:lastRenderedPageBreak/>
@@ -2504,7 +2393,7 @@
     </w:p>
     <w:p>
       <w:pPr>
-        <w:pStyle w:val="Heading2"/>
+        <w:pStyle w:val="berschrift2"/>
       </w:pPr>
       <w:r>
         <w:t>6.1 Introduction to SHAP</w:t>
@@ -2590,7 +2479,7 @@
     </w:p>
     <w:p>
       <w:pPr>
-        <w:pStyle w:val="Heading2"/>
+        <w:pStyle w:val="berschrift2"/>
       </w:pPr>
       <w:r>
         <w:t>6.2 Model Interpretation with SHAP</w:t>
@@ -2901,7 +2790,7 @@
     </w:p>
     <w:p>
       <w:pPr>
-        <w:pStyle w:val="ListParagraph"/>
+        <w:pStyle w:val="Listenabsatz"/>
         <w:numPr>
           <w:ilvl w:val="0"/>
           <w:numId w:val="17"/>
@@ -2919,7 +2808,7 @@
     </w:p>
     <w:p>
       <w:pPr>
-        <w:pStyle w:val="ListParagraph"/>
+        <w:pStyle w:val="Listenabsatz"/>
         <w:numPr>
           <w:ilvl w:val="0"/>
           <w:numId w:val="17"/>
@@ -3066,7 +2955,7 @@
     </w:p>
     <w:p>
       <w:pPr>
-        <w:pStyle w:val="Heading2"/>
+        <w:pStyle w:val="berschrift2"/>
       </w:pPr>
       <w:r>
         <w:t>7. Decision: Using SHAP for Weighting</w:t>
@@ -3165,7 +3054,7 @@
     </w:p>
     <w:tbl>
       <w:tblPr>
-        <w:tblStyle w:val="TableGrid"/>
+        <w:tblStyle w:val="Tabellenraster"/>
         <w:tblW w:w="0" w:type="auto"/>
         <w:tblLook w:val="04A0" w:firstRow="1" w:lastRow="0" w:firstColumn="1" w:lastColumn="0" w:noHBand="0" w:noVBand="1"/>
       </w:tblPr>
@@ -3792,7 +3681,7 @@
     </w:p>
     <w:tbl>
       <w:tblPr>
-        <w:tblStyle w:val="TableGrid"/>
+        <w:tblStyle w:val="Tabellenraster"/>
         <w:tblW w:w="0" w:type="auto"/>
         <w:tblLook w:val="04A0" w:firstRow="1" w:lastRow="0" w:firstColumn="1" w:lastColumn="0" w:noHBand="0" w:noVBand="1"/>
       </w:tblPr>
@@ -3982,7 +3871,7 @@
     </w:p>
     <w:p>
       <w:pPr>
-        <w:pStyle w:val="Heading2"/>
+        <w:pStyle w:val="berschrift2"/>
       </w:pPr>
       <w:r>
         <w:t>8. Calculating the Performance Score</w:t>
@@ -4101,7 +3990,7 @@
     </w:p>
     <w:p>
       <w:pPr>
-        <w:pStyle w:val="ListParagraph"/>
+        <w:pStyle w:val="Listenabsatz"/>
         <w:numPr>
           <w:ilvl w:val="0"/>
           <w:numId w:val="23"/>
@@ -4119,7 +4008,7 @@
     </w:p>
     <w:p>
       <w:pPr>
-        <w:pStyle w:val="ListParagraph"/>
+        <w:pStyle w:val="Listenabsatz"/>
         <w:numPr>
           <w:ilvl w:val="0"/>
           <w:numId w:val="23"/>
@@ -4137,7 +4026,7 @@
     </w:p>
     <w:p>
       <w:pPr>
-        <w:pStyle w:val="ListParagraph"/>
+        <w:pStyle w:val="Listenabsatz"/>
         <w:numPr>
           <w:ilvl w:val="0"/>
           <w:numId w:val="23"/>
@@ -4156,7 +4045,7 @@
     </w:p>
     <w:p>
       <w:pPr>
-        <w:pStyle w:val="ListParagraph"/>
+        <w:pStyle w:val="Listenabsatz"/>
         <w:numPr>
           <w:ilvl w:val="0"/>
           <w:numId w:val="23"/>
@@ -4174,7 +4063,7 @@
     </w:p>
     <w:p>
       <w:pPr>
-        <w:pStyle w:val="ListParagraph"/>
+        <w:pStyle w:val="Listenabsatz"/>
         <w:numPr>
           <w:ilvl w:val="0"/>
           <w:numId w:val="23"/>
@@ -4274,23 +4163,7 @@
           <w:b/>
           <w:bCs/>
         </w:rPr>
-        <w:t xml:space="preserve"> + w₂ × </w:t>
-      </w:r>
-      <w:proofErr w:type="spellStart"/>
-      <w:r>
-        <w:rPr>
-          <w:b/>
-          <w:bCs/>
-        </w:rPr>
-        <w:t>CR_norm</w:t>
-      </w:r>
-      <w:proofErr w:type="spellEnd"/>
-      <w:r>
-        <w:rPr>
-          <w:b/>
-          <w:bCs/>
-        </w:rPr>
-        <w:t xml:space="preserve"> + …)</w:t>
+        <w:t xml:space="preserve"> + w₂ × CR_norm + …)</w:t>
       </w:r>
     </w:p>
     <w:p>
@@ -4637,7 +4510,7 @@
     </w:p>
     <w:p>
       <w:pPr>
-        <w:pStyle w:val="ListParagraph"/>
+        <w:pStyle w:val="Listenabsatz"/>
         <w:numPr>
           <w:ilvl w:val="0"/>
           <w:numId w:val="37"/>
@@ -4734,7 +4607,7 @@
     </w:p>
     <w:p>
       <w:pPr>
-        <w:pStyle w:val="ListParagraph"/>
+        <w:pStyle w:val="Listenabsatz"/>
         <w:numPr>
           <w:ilvl w:val="0"/>
           <w:numId w:val="37"/>
@@ -4851,7 +4724,7 @@
     </w:p>
     <w:p>
       <w:pPr>
-        <w:pStyle w:val="ListParagraph"/>
+        <w:pStyle w:val="Listenabsatz"/>
         <w:numPr>
           <w:ilvl w:val="0"/>
           <w:numId w:val="37"/>
@@ -4934,7 +4807,7 @@
     </w:p>
     <w:p>
       <w:pPr>
-        <w:pStyle w:val="ListParagraph"/>
+        <w:pStyle w:val="Listenabsatz"/>
         <w:numPr>
           <w:ilvl w:val="0"/>
           <w:numId w:val="37"/>
@@ -5133,7 +5006,7 @@
     </w:p>
     <w:p>
       <w:pPr>
-        <w:pStyle w:val="Heading2"/>
+        <w:pStyle w:val="berschrift2"/>
       </w:pPr>
       <w:r>
         <w:t>9. Campaign Analysis in the Interactive Dashboard</w:t>
@@ -5186,10 +5059,10 @@
           <w:lang w:val="en-GB"/>
         </w:rPr>
         <w:drawing>
-          <wp:inline distT="0" distB="0" distL="0" distR="0" wp14:anchorId="78B198D2" wp14:editId="379161F2">
-            <wp:extent cx="5486400" cy="3077210"/>
-            <wp:effectExtent l="0" t="0" r="0" b="8890"/>
-            <wp:docPr id="257450844" name="Picture 1" descr="A screenshot of a computer&#10;&#10;AI-generated content may be incorrect."/>
+          <wp:inline distT="0" distB="0" distL="0" distR="0" wp14:anchorId="411FAC79" wp14:editId="624B4C4C">
+            <wp:extent cx="5486400" cy="3092450"/>
+            <wp:effectExtent l="0" t="0" r="0" b="0"/>
+            <wp:docPr id="1822703518" name="Grafik 1" descr="Ein Bild, das Text, Screenshot, Diagramm enthält.&#10;&#10;KI-generierte Inhalte können fehlerhaft sein."/>
             <wp:cNvGraphicFramePr>
               <a:graphicFrameLocks xmlns:a="http://schemas.openxmlformats.org/drawingml/2006/main" noChangeAspect="1"/>
             </wp:cNvGraphicFramePr>
@@ -5197,7 +5070,7 @@
               <a:graphicData uri="http://schemas.openxmlformats.org/drawingml/2006/picture">
                 <pic:pic xmlns:pic="http://schemas.openxmlformats.org/drawingml/2006/picture">
                   <pic:nvPicPr>
-                    <pic:cNvPr id="257450844" name="Picture 1" descr="A screenshot of a computer&#10;&#10;AI-generated content may be incorrect."/>
+                    <pic:cNvPr id="1822703518" name="Grafik 1" descr="Ein Bild, das Text, Screenshot, Diagramm enthält.&#10;&#10;KI-generierte Inhalte können fehlerhaft sein."/>
                     <pic:cNvPicPr/>
                   </pic:nvPicPr>
                   <pic:blipFill>
@@ -5209,7 +5082,7 @@
                   <pic:spPr>
                     <a:xfrm>
                       <a:off x="0" y="0"/>
-                      <a:ext cx="5486400" cy="3077210"/>
+                      <a:ext cx="5486400" cy="3092450"/>
                     </a:xfrm>
                     <a:prstGeom prst="rect">
                       <a:avLst/>
@@ -5474,14 +5347,13 @@
       </w:pPr>
       <w:r>
         <w:rPr>
-          <w:noProof/>
           <w:lang w:val="en-GB"/>
         </w:rPr>
         <w:drawing>
-          <wp:inline distT="0" distB="0" distL="0" distR="0" wp14:anchorId="0AE36B27" wp14:editId="5EE79D31">
-            <wp:extent cx="5486400" cy="2690495"/>
-            <wp:effectExtent l="0" t="0" r="0" b="0"/>
-            <wp:docPr id="1462443180" name="Picture 1" descr="A screenshot of a computer&#10;&#10;AI-generated content may be incorrect."/>
+          <wp:inline distT="0" distB="0" distL="0" distR="0" wp14:anchorId="39B80534" wp14:editId="25802176">
+            <wp:extent cx="5486400" cy="3082925"/>
+            <wp:effectExtent l="0" t="0" r="0" b="3175"/>
+            <wp:docPr id="1366456836" name="Grafik 1" descr="Ein Bild, das Text, Screenshot, Zahl, Software enthält.&#10;&#10;KI-generierte Inhalte können fehlerhaft sein."/>
             <wp:cNvGraphicFramePr>
               <a:graphicFrameLocks xmlns:a="http://schemas.openxmlformats.org/drawingml/2006/main" noChangeAspect="1"/>
             </wp:cNvGraphicFramePr>
@@ -5489,7 +5361,7 @@
               <a:graphicData uri="http://schemas.openxmlformats.org/drawingml/2006/picture">
                 <pic:pic xmlns:pic="http://schemas.openxmlformats.org/drawingml/2006/picture">
                   <pic:nvPicPr>
-                    <pic:cNvPr id="1462443180" name="Picture 1" descr="A screenshot of a computer&#10;&#10;AI-generated content may be incorrect."/>
+                    <pic:cNvPr id="1366456836" name="Grafik 1" descr="Ein Bild, das Text, Screenshot, Zahl, Software enthält.&#10;&#10;KI-generierte Inhalte können fehlerhaft sein."/>
                     <pic:cNvPicPr/>
                   </pic:nvPicPr>
                   <pic:blipFill>
@@ -5501,7 +5373,7 @@
                   <pic:spPr>
                     <a:xfrm>
                       <a:off x="0" y="0"/>
-                      <a:ext cx="5486400" cy="2690495"/>
+                      <a:ext cx="5486400" cy="3082925"/>
                     </a:xfrm>
                     <a:prstGeom prst="rect">
                       <a:avLst/>
@@ -5614,7 +5486,7 @@
     </w:p>
     <w:p>
       <w:pPr>
-        <w:pStyle w:val="Heading2"/>
+        <w:pStyle w:val="berschrift2"/>
       </w:pPr>
       <w:r>
         <w:t>10. Reflection</w:t>
@@ -5672,7 +5544,14 @@
           <w:lang w:val="en-GB"/>
         </w:rPr>
         <w:br/>
-        <w:t>revenue figures, ROAS (Return on Ad Spend), Customer Lifetime Value, and soft interactions like likes, comments, and shares—especially in branding campaigns. Additionally, the actual impact of clicks and engagement on conversions is more complex than a purely numerical dataset can reflect.</w:t>
+        <w:t xml:space="preserve">revenue figures, ROAS (Return on Ad Spend), Customer Lifetime Value, and soft interactions like likes, comments, and shares—especially in branding campaigns. Additionally, the actual </w:t>
+      </w:r>
+      <w:r>
+        <w:rPr>
+          <w:lang w:val="en-GB"/>
+        </w:rPr>
+        <w:lastRenderedPageBreak/>
+        <w:t>impact of clicks and engagement on conversions is more complex than a purely numerical dataset can reflect.</w:t>
       </w:r>
     </w:p>
     <w:p>
@@ -5685,7 +5564,6 @@
         <w:rPr>
           <w:lang w:val="en-GB"/>
         </w:rPr>
-        <w:lastRenderedPageBreak/>
         <w:t>Despite these limitations, the project provided a practical introduction to applying statistical and analytical methods:</w:t>
       </w:r>
     </w:p>
@@ -6052,7 +5930,7 @@
     <w:lvl w:ilvl="0">
       <w:start w:val="1"/>
       <w:numFmt w:val="decimal"/>
-      <w:pStyle w:val="ListNumber3"/>
+      <w:pStyle w:val="Listennummer3"/>
       <w:lvlText w:val="%1."/>
       <w:lvlJc w:val="left"/>
       <w:pPr>
@@ -6070,7 +5948,7 @@
     <w:lvl w:ilvl="0">
       <w:start w:val="1"/>
       <w:numFmt w:val="decimal"/>
-      <w:pStyle w:val="ListNumber2"/>
+      <w:pStyle w:val="Listennummer2"/>
       <w:lvlText w:val="%1."/>
       <w:lvlJc w:val="left"/>
       <w:pPr>
@@ -6108,7 +5986,7 @@
     <w:lvl w:ilvl="0">
       <w:start w:val="1"/>
       <w:numFmt w:val="bullet"/>
-      <w:pStyle w:val="ListBullet3"/>
+      <w:pStyle w:val="Aufzhlungszeichen3"/>
       <w:lvlText w:val=""/>
       <w:lvlJc w:val="left"/>
       <w:pPr>
@@ -6129,7 +6007,7 @@
     <w:lvl w:ilvl="0">
       <w:start w:val="1"/>
       <w:numFmt w:val="bullet"/>
-      <w:pStyle w:val="ListBullet2"/>
+      <w:pStyle w:val="Aufzhlungszeichen2"/>
       <w:lvlText w:val=""/>
       <w:lvlJc w:val="left"/>
       <w:pPr>
@@ -6150,7 +6028,7 @@
     <w:lvl w:ilvl="0">
       <w:start w:val="1"/>
       <w:numFmt w:val="decimal"/>
-      <w:pStyle w:val="ListNumber"/>
+      <w:pStyle w:val="Listennummer"/>
       <w:lvlText w:val="%1."/>
       <w:lvlJc w:val="left"/>
       <w:pPr>
@@ -6168,7 +6046,7 @@
     <w:lvl w:ilvl="0">
       <w:start w:val="1"/>
       <w:numFmt w:val="bullet"/>
-      <w:pStyle w:val="ListBullet"/>
+      <w:pStyle w:val="Aufzhlungszeichen"/>
       <w:lvlText w:val=""/>
       <w:lvlJc w:val="left"/>
       <w:pPr>
@@ -10566,16 +10444,16 @@
     <w:lsdException w:name="Unresolved Mention" w:semiHidden="1" w:unhideWhenUsed="1"/>
     <w:lsdException w:name="Smart Link" w:semiHidden="1" w:unhideWhenUsed="1"/>
   </w:latentStyles>
-  <w:style w:type="paragraph" w:default="1" w:styleId="Normal">
+  <w:style w:type="paragraph" w:default="1" w:styleId="Standard">
     <w:name w:val="Normal"/>
     <w:qFormat/>
     <w:rsid w:val="00FC693F"/>
   </w:style>
-  <w:style w:type="paragraph" w:styleId="Heading1">
+  <w:style w:type="paragraph" w:styleId="berschrift1">
     <w:name w:val="heading 1"/>
-    <w:basedOn w:val="Normal"/>
-    <w:next w:val="Normal"/>
-    <w:link w:val="Heading1Char"/>
+    <w:basedOn w:val="Standard"/>
+    <w:next w:val="Standard"/>
+    <w:link w:val="berschrift1Zchn"/>
     <w:uiPriority w:val="9"/>
     <w:qFormat/>
     <w:rsid w:val="00FC693F"/>
@@ -10594,11 +10472,11 @@
       <w:szCs w:val="28"/>
     </w:rPr>
   </w:style>
-  <w:style w:type="paragraph" w:styleId="Heading2">
+  <w:style w:type="paragraph" w:styleId="berschrift2">
     <w:name w:val="heading 2"/>
-    <w:basedOn w:val="Normal"/>
-    <w:next w:val="Normal"/>
-    <w:link w:val="Heading2Char"/>
+    <w:basedOn w:val="Standard"/>
+    <w:next w:val="Standard"/>
+    <w:link w:val="berschrift2Zchn"/>
     <w:uiPriority w:val="9"/>
     <w:unhideWhenUsed/>
     <w:qFormat/>
@@ -10618,11 +10496,11 @@
       <w:szCs w:val="26"/>
     </w:rPr>
   </w:style>
-  <w:style w:type="paragraph" w:styleId="Heading3">
+  <w:style w:type="paragraph" w:styleId="berschrift3">
     <w:name w:val="heading 3"/>
-    <w:basedOn w:val="Normal"/>
-    <w:next w:val="Normal"/>
-    <w:link w:val="Heading3Char"/>
+    <w:basedOn w:val="Standard"/>
+    <w:next w:val="Standard"/>
+    <w:link w:val="berschrift3Zchn"/>
     <w:uiPriority w:val="9"/>
     <w:unhideWhenUsed/>
     <w:qFormat/>
@@ -10640,11 +10518,11 @@
       <w:color w:val="4F81BD" w:themeColor="accent1"/>
     </w:rPr>
   </w:style>
-  <w:style w:type="paragraph" w:styleId="Heading4">
+  <w:style w:type="paragraph" w:styleId="berschrift4">
     <w:name w:val="heading 4"/>
-    <w:basedOn w:val="Normal"/>
-    <w:next w:val="Normal"/>
-    <w:link w:val="Heading4Char"/>
+    <w:basedOn w:val="Standard"/>
+    <w:next w:val="Standard"/>
+    <w:link w:val="berschrift4Zchn"/>
     <w:uiPriority w:val="9"/>
     <w:semiHidden/>
     <w:unhideWhenUsed/>
@@ -10665,11 +10543,11 @@
       <w:color w:val="4F81BD" w:themeColor="accent1"/>
     </w:rPr>
   </w:style>
-  <w:style w:type="paragraph" w:styleId="Heading5">
+  <w:style w:type="paragraph" w:styleId="berschrift5">
     <w:name w:val="heading 5"/>
-    <w:basedOn w:val="Normal"/>
-    <w:next w:val="Normal"/>
-    <w:link w:val="Heading5Char"/>
+    <w:basedOn w:val="Standard"/>
+    <w:next w:val="Standard"/>
+    <w:link w:val="berschrift5Zchn"/>
     <w:uiPriority w:val="9"/>
     <w:semiHidden/>
     <w:unhideWhenUsed/>
@@ -10686,11 +10564,11 @@
       <w:color w:val="243F60" w:themeColor="accent1" w:themeShade="7F"/>
     </w:rPr>
   </w:style>
-  <w:style w:type="paragraph" w:styleId="Heading6">
+  <w:style w:type="paragraph" w:styleId="berschrift6">
     <w:name w:val="heading 6"/>
-    <w:basedOn w:val="Normal"/>
-    <w:next w:val="Normal"/>
-    <w:link w:val="Heading6Char"/>
+    <w:basedOn w:val="Standard"/>
+    <w:next w:val="Standard"/>
+    <w:link w:val="berschrift6Zchn"/>
     <w:uiPriority w:val="9"/>
     <w:semiHidden/>
     <w:unhideWhenUsed/>
@@ -10709,11 +10587,11 @@
       <w:color w:val="243F60" w:themeColor="accent1" w:themeShade="7F"/>
     </w:rPr>
   </w:style>
-  <w:style w:type="paragraph" w:styleId="Heading7">
+  <w:style w:type="paragraph" w:styleId="berschrift7">
     <w:name w:val="heading 7"/>
-    <w:basedOn w:val="Normal"/>
-    <w:next w:val="Normal"/>
-    <w:link w:val="Heading7Char"/>
+    <w:basedOn w:val="Standard"/>
+    <w:next w:val="Standard"/>
+    <w:link w:val="berschrift7Zchn"/>
     <w:uiPriority w:val="9"/>
     <w:semiHidden/>
     <w:unhideWhenUsed/>
@@ -10732,11 +10610,11 @@
       <w:color w:val="404040" w:themeColor="text1" w:themeTint="BF"/>
     </w:rPr>
   </w:style>
-  <w:style w:type="paragraph" w:styleId="Heading8">
+  <w:style w:type="paragraph" w:styleId="berschrift8">
     <w:name w:val="heading 8"/>
-    <w:basedOn w:val="Normal"/>
-    <w:next w:val="Normal"/>
-    <w:link w:val="Heading8Char"/>
+    <w:basedOn w:val="Standard"/>
+    <w:next w:val="Standard"/>
+    <w:link w:val="berschrift8Zchn"/>
     <w:uiPriority w:val="9"/>
     <w:semiHidden/>
     <w:unhideWhenUsed/>
@@ -10755,11 +10633,11 @@
       <w:szCs w:val="20"/>
     </w:rPr>
   </w:style>
-  <w:style w:type="paragraph" w:styleId="Heading9">
+  <w:style w:type="paragraph" w:styleId="berschrift9">
     <w:name w:val="heading 9"/>
-    <w:basedOn w:val="Normal"/>
-    <w:next w:val="Normal"/>
-    <w:link w:val="Heading9Char"/>
+    <w:basedOn w:val="Standard"/>
+    <w:next w:val="Standard"/>
+    <w:link w:val="berschrift9Zchn"/>
     <w:uiPriority w:val="9"/>
     <w:semiHidden/>
     <w:unhideWhenUsed/>
@@ -10780,13 +10658,13 @@
       <w:szCs w:val="20"/>
     </w:rPr>
   </w:style>
-  <w:style w:type="character" w:default="1" w:styleId="DefaultParagraphFont">
+  <w:style w:type="character" w:default="1" w:styleId="Absatz-Standardschriftart">
     <w:name w:val="Default Paragraph Font"/>
     <w:uiPriority w:val="1"/>
     <w:semiHidden/>
     <w:unhideWhenUsed/>
   </w:style>
-  <w:style w:type="table" w:default="1" w:styleId="TableNormal">
+  <w:style w:type="table" w:default="1" w:styleId="NormaleTabelle">
     <w:name w:val="Normal Table"/>
     <w:uiPriority w:val="99"/>
     <w:semiHidden/>
@@ -10801,16 +10679,16 @@
       </w:tblCellMar>
     </w:tblPr>
   </w:style>
-  <w:style w:type="numbering" w:default="1" w:styleId="NoList">
+  <w:style w:type="numbering" w:default="1" w:styleId="KeineListe">
     <w:name w:val="No List"/>
     <w:uiPriority w:val="99"/>
     <w:semiHidden/>
     <w:unhideWhenUsed/>
   </w:style>
-  <w:style w:type="paragraph" w:styleId="Header">
+  <w:style w:type="paragraph" w:styleId="Kopfzeile">
     <w:name w:val="header"/>
-    <w:basedOn w:val="Normal"/>
-    <w:link w:val="HeaderChar"/>
+    <w:basedOn w:val="Standard"/>
+    <w:link w:val="KopfzeileZchn"/>
     <w:uiPriority w:val="99"/>
     <w:unhideWhenUsed/>
     <w:rsid w:val="00E618BF"/>
@@ -10822,17 +10700,17 @@
       <w:spacing w:after="0" w:line="240" w:lineRule="auto"/>
     </w:pPr>
   </w:style>
-  <w:style w:type="character" w:customStyle="1" w:styleId="HeaderChar">
-    <w:name w:val="Header Char"/>
-    <w:basedOn w:val="DefaultParagraphFont"/>
-    <w:link w:val="Header"/>
+  <w:style w:type="character" w:customStyle="1" w:styleId="KopfzeileZchn">
+    <w:name w:val="Kopfzeile Zchn"/>
+    <w:basedOn w:val="Absatz-Standardschriftart"/>
+    <w:link w:val="Kopfzeile"/>
     <w:uiPriority w:val="99"/>
     <w:rsid w:val="00E618BF"/>
   </w:style>
-  <w:style w:type="paragraph" w:styleId="Footer">
+  <w:style w:type="paragraph" w:styleId="Fuzeile">
     <w:name w:val="footer"/>
-    <w:basedOn w:val="Normal"/>
-    <w:link w:val="FooterChar"/>
+    <w:basedOn w:val="Standard"/>
+    <w:link w:val="FuzeileZchn"/>
     <w:uiPriority w:val="99"/>
     <w:unhideWhenUsed/>
     <w:rsid w:val="00E618BF"/>
@@ -10844,14 +10722,14 @@
       <w:spacing w:after="0" w:line="240" w:lineRule="auto"/>
     </w:pPr>
   </w:style>
-  <w:style w:type="character" w:customStyle="1" w:styleId="FooterChar">
-    <w:name w:val="Footer Char"/>
-    <w:basedOn w:val="DefaultParagraphFont"/>
-    <w:link w:val="Footer"/>
+  <w:style w:type="character" w:customStyle="1" w:styleId="FuzeileZchn">
+    <w:name w:val="Fußzeile Zchn"/>
+    <w:basedOn w:val="Absatz-Standardschriftart"/>
+    <w:link w:val="Fuzeile"/>
     <w:uiPriority w:val="99"/>
     <w:rsid w:val="00E618BF"/>
   </w:style>
-  <w:style w:type="paragraph" w:styleId="NoSpacing">
+  <w:style w:type="paragraph" w:styleId="KeinLeerraum">
     <w:name w:val="No Spacing"/>
     <w:uiPriority w:val="1"/>
     <w:qFormat/>
@@ -10860,10 +10738,10 @@
       <w:spacing w:after="0" w:line="240" w:lineRule="auto"/>
     </w:pPr>
   </w:style>
-  <w:style w:type="character" w:customStyle="1" w:styleId="Heading1Char">
-    <w:name w:val="Heading 1 Char"/>
-    <w:basedOn w:val="DefaultParagraphFont"/>
-    <w:link w:val="Heading1"/>
+  <w:style w:type="character" w:customStyle="1" w:styleId="berschrift1Zchn">
+    <w:name w:val="Überschrift 1 Zchn"/>
+    <w:basedOn w:val="Absatz-Standardschriftart"/>
+    <w:link w:val="berschrift1"/>
     <w:uiPriority w:val="9"/>
     <w:rsid w:val="00FC693F"/>
     <w:rPr>
@@ -10875,10 +10753,10 @@
       <w:szCs w:val="28"/>
     </w:rPr>
   </w:style>
-  <w:style w:type="character" w:customStyle="1" w:styleId="Heading2Char">
-    <w:name w:val="Heading 2 Char"/>
-    <w:basedOn w:val="DefaultParagraphFont"/>
-    <w:link w:val="Heading2"/>
+  <w:style w:type="character" w:customStyle="1" w:styleId="berschrift2Zchn">
+    <w:name w:val="Überschrift 2 Zchn"/>
+    <w:basedOn w:val="Absatz-Standardschriftart"/>
+    <w:link w:val="berschrift2"/>
     <w:uiPriority w:val="9"/>
     <w:rsid w:val="00FC693F"/>
     <w:rPr>
@@ -10890,10 +10768,10 @@
       <w:szCs w:val="26"/>
     </w:rPr>
   </w:style>
-  <w:style w:type="character" w:customStyle="1" w:styleId="Heading3Char">
-    <w:name w:val="Heading 3 Char"/>
-    <w:basedOn w:val="DefaultParagraphFont"/>
-    <w:link w:val="Heading3"/>
+  <w:style w:type="character" w:customStyle="1" w:styleId="berschrift3Zchn">
+    <w:name w:val="Überschrift 3 Zchn"/>
+    <w:basedOn w:val="Absatz-Standardschriftart"/>
+    <w:link w:val="berschrift3"/>
     <w:uiPriority w:val="9"/>
     <w:rsid w:val="00FC693F"/>
     <w:rPr>
@@ -10903,11 +10781,11 @@
       <w:color w:val="4F81BD" w:themeColor="accent1"/>
     </w:rPr>
   </w:style>
-  <w:style w:type="paragraph" w:styleId="Title">
+  <w:style w:type="paragraph" w:styleId="Titel">
     <w:name w:val="Title"/>
-    <w:basedOn w:val="Normal"/>
-    <w:next w:val="Normal"/>
-    <w:link w:val="TitleChar"/>
+    <w:basedOn w:val="Standard"/>
+    <w:next w:val="Standard"/>
+    <w:link w:val="TitelZchn"/>
     <w:uiPriority w:val="10"/>
     <w:qFormat/>
     <w:rsid w:val="00FC693F"/>
@@ -10927,10 +10805,10 @@
       <w:szCs w:val="52"/>
     </w:rPr>
   </w:style>
-  <w:style w:type="character" w:customStyle="1" w:styleId="TitleChar">
-    <w:name w:val="Title Char"/>
-    <w:basedOn w:val="DefaultParagraphFont"/>
-    <w:link w:val="Title"/>
+  <w:style w:type="character" w:customStyle="1" w:styleId="TitelZchn">
+    <w:name w:val="Titel Zchn"/>
+    <w:basedOn w:val="Absatz-Standardschriftart"/>
+    <w:link w:val="Titel"/>
     <w:uiPriority w:val="10"/>
     <w:rsid w:val="00FC693F"/>
     <w:rPr>
@@ -10942,11 +10820,11 @@
       <w:szCs w:val="52"/>
     </w:rPr>
   </w:style>
-  <w:style w:type="paragraph" w:styleId="Subtitle">
+  <w:style w:type="paragraph" w:styleId="Untertitel">
     <w:name w:val="Subtitle"/>
-    <w:basedOn w:val="Normal"/>
-    <w:next w:val="Normal"/>
-    <w:link w:val="SubtitleChar"/>
+    <w:basedOn w:val="Standard"/>
+    <w:next w:val="Standard"/>
+    <w:link w:val="UntertitelZchn"/>
     <w:uiPriority w:val="11"/>
     <w:qFormat/>
     <w:rsid w:val="00FC693F"/>
@@ -10965,10 +10843,10 @@
       <w:szCs w:val="24"/>
     </w:rPr>
   </w:style>
-  <w:style w:type="character" w:customStyle="1" w:styleId="SubtitleChar">
-    <w:name w:val="Subtitle Char"/>
-    <w:basedOn w:val="DefaultParagraphFont"/>
-    <w:link w:val="Subtitle"/>
+  <w:style w:type="character" w:customStyle="1" w:styleId="UntertitelZchn">
+    <w:name w:val="Untertitel Zchn"/>
+    <w:basedOn w:val="Absatz-Standardschriftart"/>
+    <w:link w:val="Untertitel"/>
     <w:uiPriority w:val="11"/>
     <w:rsid w:val="00FC693F"/>
     <w:rPr>
@@ -10981,9 +10859,9 @@
       <w:szCs w:val="24"/>
     </w:rPr>
   </w:style>
-  <w:style w:type="paragraph" w:styleId="ListParagraph">
+  <w:style w:type="paragraph" w:styleId="Listenabsatz">
     <w:name w:val="List Paragraph"/>
-    <w:basedOn w:val="Normal"/>
+    <w:basedOn w:val="Standard"/>
     <w:uiPriority w:val="34"/>
     <w:qFormat/>
     <w:rsid w:val="00FC693F"/>
@@ -10992,10 +10870,10 @@
       <w:contextualSpacing/>
     </w:pPr>
   </w:style>
-  <w:style w:type="paragraph" w:styleId="BodyText">
+  <w:style w:type="paragraph" w:styleId="Textkrper">
     <w:name w:val="Body Text"/>
-    <w:basedOn w:val="Normal"/>
-    <w:link w:val="BodyTextChar"/>
+    <w:basedOn w:val="Standard"/>
+    <w:link w:val="TextkrperZchn"/>
     <w:uiPriority w:val="99"/>
     <w:unhideWhenUsed/>
     <w:rsid w:val="00AA1D8D"/>
@@ -11003,17 +10881,17 @@
       <w:spacing w:after="120"/>
     </w:pPr>
   </w:style>
-  <w:style w:type="character" w:customStyle="1" w:styleId="BodyTextChar">
-    <w:name w:val="Body Text Char"/>
-    <w:basedOn w:val="DefaultParagraphFont"/>
-    <w:link w:val="BodyText"/>
+  <w:style w:type="character" w:customStyle="1" w:styleId="TextkrperZchn">
+    <w:name w:val="Textkörper Zchn"/>
+    <w:basedOn w:val="Absatz-Standardschriftart"/>
+    <w:link w:val="Textkrper"/>
     <w:uiPriority w:val="99"/>
     <w:rsid w:val="00AA1D8D"/>
   </w:style>
-  <w:style w:type="paragraph" w:styleId="BodyText2">
+  <w:style w:type="paragraph" w:styleId="Textkrper2">
     <w:name w:val="Body Text 2"/>
-    <w:basedOn w:val="Normal"/>
-    <w:link w:val="BodyText2Char"/>
+    <w:basedOn w:val="Standard"/>
+    <w:link w:val="Textkrper2Zchn"/>
     <w:uiPriority w:val="99"/>
     <w:unhideWhenUsed/>
     <w:rsid w:val="00AA1D8D"/>
@@ -11021,17 +10899,17 @@
       <w:spacing w:after="120" w:line="480" w:lineRule="auto"/>
     </w:pPr>
   </w:style>
-  <w:style w:type="character" w:customStyle="1" w:styleId="BodyText2Char">
-    <w:name w:val="Body Text 2 Char"/>
-    <w:basedOn w:val="DefaultParagraphFont"/>
-    <w:link w:val="BodyText2"/>
+  <w:style w:type="character" w:customStyle="1" w:styleId="Textkrper2Zchn">
+    <w:name w:val="Textkörper 2 Zchn"/>
+    <w:basedOn w:val="Absatz-Standardschriftart"/>
+    <w:link w:val="Textkrper2"/>
     <w:uiPriority w:val="99"/>
     <w:rsid w:val="00AA1D8D"/>
   </w:style>
-  <w:style w:type="paragraph" w:styleId="BodyText3">
+  <w:style w:type="paragraph" w:styleId="Textkrper3">
     <w:name w:val="Body Text 3"/>
-    <w:basedOn w:val="Normal"/>
-    <w:link w:val="BodyText3Char"/>
+    <w:basedOn w:val="Standard"/>
+    <w:link w:val="Textkrper3Zchn"/>
     <w:uiPriority w:val="99"/>
     <w:unhideWhenUsed/>
     <w:rsid w:val="00AA1D8D"/>
@@ -11043,10 +10921,10 @@
       <w:szCs w:val="16"/>
     </w:rPr>
   </w:style>
-  <w:style w:type="character" w:customStyle="1" w:styleId="BodyText3Char">
-    <w:name w:val="Body Text 3 Char"/>
-    <w:basedOn w:val="DefaultParagraphFont"/>
-    <w:link w:val="BodyText3"/>
+  <w:style w:type="character" w:customStyle="1" w:styleId="Textkrper3Zchn">
+    <w:name w:val="Textkörper 3 Zchn"/>
+    <w:basedOn w:val="Absatz-Standardschriftart"/>
+    <w:link w:val="Textkrper3"/>
     <w:uiPriority w:val="99"/>
     <w:rsid w:val="00AA1D8D"/>
     <w:rPr>
@@ -11054,9 +10932,9 @@
       <w:szCs w:val="16"/>
     </w:rPr>
   </w:style>
-  <w:style w:type="paragraph" w:styleId="List">
+  <w:style w:type="paragraph" w:styleId="Liste">
     <w:name w:val="List"/>
-    <w:basedOn w:val="Normal"/>
+    <w:basedOn w:val="Standard"/>
     <w:uiPriority w:val="99"/>
     <w:unhideWhenUsed/>
     <w:rsid w:val="00AA1D8D"/>
@@ -11065,9 +10943,9 @@
       <w:contextualSpacing/>
     </w:pPr>
   </w:style>
-  <w:style w:type="paragraph" w:styleId="List2">
+  <w:style w:type="paragraph" w:styleId="Liste2">
     <w:name w:val="List 2"/>
-    <w:basedOn w:val="Normal"/>
+    <w:basedOn w:val="Standard"/>
     <w:uiPriority w:val="99"/>
     <w:unhideWhenUsed/>
     <w:rsid w:val="00326F90"/>
@@ -11076,9 +10954,9 @@
       <w:contextualSpacing/>
     </w:pPr>
   </w:style>
-  <w:style w:type="paragraph" w:styleId="List3">
+  <w:style w:type="paragraph" w:styleId="Liste3">
     <w:name w:val="List 3"/>
-    <w:basedOn w:val="Normal"/>
+    <w:basedOn w:val="Standard"/>
     <w:uiPriority w:val="99"/>
     <w:unhideWhenUsed/>
     <w:rsid w:val="00326F90"/>
@@ -11087,9 +10965,9 @@
       <w:contextualSpacing/>
     </w:pPr>
   </w:style>
-  <w:style w:type="paragraph" w:styleId="ListBullet">
+  <w:style w:type="paragraph" w:styleId="Aufzhlungszeichen">
     <w:name w:val="List Bullet"/>
-    <w:basedOn w:val="Normal"/>
+    <w:basedOn w:val="Standard"/>
     <w:uiPriority w:val="99"/>
     <w:unhideWhenUsed/>
     <w:rsid w:val="00326F90"/>
@@ -11100,9 +10978,9 @@
       <w:contextualSpacing/>
     </w:pPr>
   </w:style>
-  <w:style w:type="paragraph" w:styleId="ListBullet2">
+  <w:style w:type="paragraph" w:styleId="Aufzhlungszeichen2">
     <w:name w:val="List Bullet 2"/>
-    <w:basedOn w:val="Normal"/>
+    <w:basedOn w:val="Standard"/>
     <w:uiPriority w:val="99"/>
     <w:unhideWhenUsed/>
     <w:rsid w:val="00326F90"/>
@@ -11113,9 +10991,9 @@
       <w:contextualSpacing/>
     </w:pPr>
   </w:style>
-  <w:style w:type="paragraph" w:styleId="ListBullet3">
+  <w:style w:type="paragraph" w:styleId="Aufzhlungszeichen3">
     <w:name w:val="List Bullet 3"/>
-    <w:basedOn w:val="Normal"/>
+    <w:basedOn w:val="Standard"/>
     <w:uiPriority w:val="99"/>
     <w:unhideWhenUsed/>
     <w:rsid w:val="00326F90"/>
@@ -11126,9 +11004,9 @@
       <w:contextualSpacing/>
     </w:pPr>
   </w:style>
-  <w:style w:type="paragraph" w:styleId="ListNumber">
+  <w:style w:type="paragraph" w:styleId="Listennummer">
     <w:name w:val="List Number"/>
-    <w:basedOn w:val="Normal"/>
+    <w:basedOn w:val="Standard"/>
     <w:uiPriority w:val="99"/>
     <w:unhideWhenUsed/>
     <w:rsid w:val="00326F90"/>
@@ -11139,9 +11017,9 @@
       <w:contextualSpacing/>
     </w:pPr>
   </w:style>
-  <w:style w:type="paragraph" w:styleId="ListNumber2">
+  <w:style w:type="paragraph" w:styleId="Listennummer2">
     <w:name w:val="List Number 2"/>
-    <w:basedOn w:val="Normal"/>
+    <w:basedOn w:val="Standard"/>
     <w:uiPriority w:val="99"/>
     <w:unhideWhenUsed/>
     <w:rsid w:val="0029639D"/>
@@ -11152,9 +11030,9 @@
       <w:contextualSpacing/>
     </w:pPr>
   </w:style>
-  <w:style w:type="paragraph" w:styleId="ListNumber3">
+  <w:style w:type="paragraph" w:styleId="Listennummer3">
     <w:name w:val="List Number 3"/>
-    <w:basedOn w:val="Normal"/>
+    <w:basedOn w:val="Standard"/>
     <w:uiPriority w:val="99"/>
     <w:unhideWhenUsed/>
     <w:rsid w:val="0029639D"/>
@@ -11165,9 +11043,9 @@
       <w:contextualSpacing/>
     </w:pPr>
   </w:style>
-  <w:style w:type="paragraph" w:styleId="ListContinue">
+  <w:style w:type="paragraph" w:styleId="Listenfortsetzung">
     <w:name w:val="List Continue"/>
-    <w:basedOn w:val="Normal"/>
+    <w:basedOn w:val="Standard"/>
     <w:uiPriority w:val="99"/>
     <w:unhideWhenUsed/>
     <w:rsid w:val="0029639D"/>
@@ -11177,9 +11055,9 @@
       <w:contextualSpacing/>
     </w:pPr>
   </w:style>
-  <w:style w:type="paragraph" w:styleId="ListContinue2">
+  <w:style w:type="paragraph" w:styleId="Listenfortsetzung2">
     <w:name w:val="List Continue 2"/>
-    <w:basedOn w:val="Normal"/>
+    <w:basedOn w:val="Standard"/>
     <w:uiPriority w:val="99"/>
     <w:unhideWhenUsed/>
     <w:rsid w:val="0029639D"/>
@@ -11189,9 +11067,9 @@
       <w:contextualSpacing/>
     </w:pPr>
   </w:style>
-  <w:style w:type="paragraph" w:styleId="ListContinue3">
+  <w:style w:type="paragraph" w:styleId="Listenfortsetzung3">
     <w:name w:val="List Continue 3"/>
-    <w:basedOn w:val="Normal"/>
+    <w:basedOn w:val="Standard"/>
     <w:uiPriority w:val="99"/>
     <w:unhideWhenUsed/>
     <w:rsid w:val="0029639D"/>
@@ -11201,9 +11079,9 @@
       <w:contextualSpacing/>
     </w:pPr>
   </w:style>
-  <w:style w:type="paragraph" w:styleId="MacroText">
+  <w:style w:type="paragraph" w:styleId="Makrotext">
     <w:name w:val="macro"/>
-    <w:link w:val="MacroTextChar"/>
+    <w:link w:val="MakrotextZchn"/>
     <w:uiPriority w:val="99"/>
     <w:unhideWhenUsed/>
     <w:rsid w:val="0029639D"/>
@@ -11224,10 +11102,10 @@
       <w:szCs w:val="20"/>
     </w:rPr>
   </w:style>
-  <w:style w:type="character" w:customStyle="1" w:styleId="MacroTextChar">
-    <w:name w:val="Macro Text Char"/>
-    <w:basedOn w:val="DefaultParagraphFont"/>
-    <w:link w:val="MacroText"/>
+  <w:style w:type="character" w:customStyle="1" w:styleId="MakrotextZchn">
+    <w:name w:val="Makrotext Zchn"/>
+    <w:basedOn w:val="Absatz-Standardschriftart"/>
+    <w:link w:val="Makrotext"/>
     <w:uiPriority w:val="99"/>
     <w:rsid w:val="0029639D"/>
     <w:rPr>
@@ -11236,11 +11114,11 @@
       <w:szCs w:val="20"/>
     </w:rPr>
   </w:style>
-  <w:style w:type="paragraph" w:styleId="Quote">
+  <w:style w:type="paragraph" w:styleId="Zitat">
     <w:name w:val="Quote"/>
-    <w:basedOn w:val="Normal"/>
-    <w:next w:val="Normal"/>
-    <w:link w:val="QuoteChar"/>
+    <w:basedOn w:val="Standard"/>
+    <w:next w:val="Standard"/>
+    <w:link w:val="ZitatZchn"/>
     <w:uiPriority w:val="29"/>
     <w:qFormat/>
     <w:rsid w:val="00FC693F"/>
@@ -11250,10 +11128,10 @@
       <w:color w:val="000000" w:themeColor="text1"/>
     </w:rPr>
   </w:style>
-  <w:style w:type="character" w:customStyle="1" w:styleId="QuoteChar">
-    <w:name w:val="Quote Char"/>
-    <w:basedOn w:val="DefaultParagraphFont"/>
-    <w:link w:val="Quote"/>
+  <w:style w:type="character" w:customStyle="1" w:styleId="ZitatZchn">
+    <w:name w:val="Zitat Zchn"/>
+    <w:basedOn w:val="Absatz-Standardschriftart"/>
+    <w:link w:val="Zitat"/>
     <w:uiPriority w:val="29"/>
     <w:rsid w:val="00FC693F"/>
     <w:rPr>
@@ -11262,10 +11140,10 @@
       <w:color w:val="000000" w:themeColor="text1"/>
     </w:rPr>
   </w:style>
-  <w:style w:type="character" w:customStyle="1" w:styleId="Heading4Char">
-    <w:name w:val="Heading 4 Char"/>
-    <w:basedOn w:val="DefaultParagraphFont"/>
-    <w:link w:val="Heading4"/>
+  <w:style w:type="character" w:customStyle="1" w:styleId="berschrift4Zchn">
+    <w:name w:val="Überschrift 4 Zchn"/>
+    <w:basedOn w:val="Absatz-Standardschriftart"/>
+    <w:link w:val="berschrift4"/>
     <w:uiPriority w:val="9"/>
     <w:semiHidden/>
     <w:rsid w:val="00FC693F"/>
@@ -11278,10 +11156,10 @@
       <w:color w:val="4F81BD" w:themeColor="accent1"/>
     </w:rPr>
   </w:style>
-  <w:style w:type="character" w:customStyle="1" w:styleId="Heading5Char">
-    <w:name w:val="Heading 5 Char"/>
-    <w:basedOn w:val="DefaultParagraphFont"/>
-    <w:link w:val="Heading5"/>
+  <w:style w:type="character" w:customStyle="1" w:styleId="berschrift5Zchn">
+    <w:name w:val="Überschrift 5 Zchn"/>
+    <w:basedOn w:val="Absatz-Standardschriftart"/>
+    <w:link w:val="berschrift5"/>
     <w:uiPriority w:val="9"/>
     <w:semiHidden/>
     <w:rsid w:val="00FC693F"/>
@@ -11290,10 +11168,10 @@
       <w:color w:val="243F60" w:themeColor="accent1" w:themeShade="7F"/>
     </w:rPr>
   </w:style>
-  <w:style w:type="character" w:customStyle="1" w:styleId="Heading6Char">
-    <w:name w:val="Heading 6 Char"/>
-    <w:basedOn w:val="DefaultParagraphFont"/>
-    <w:link w:val="Heading6"/>
+  <w:style w:type="character" w:customStyle="1" w:styleId="berschrift6Zchn">
+    <w:name w:val="Überschrift 6 Zchn"/>
+    <w:basedOn w:val="Absatz-Standardschriftart"/>
+    <w:link w:val="berschrift6"/>
     <w:uiPriority w:val="9"/>
     <w:semiHidden/>
     <w:rsid w:val="00FC693F"/>
@@ -11304,10 +11182,10 @@
       <w:color w:val="243F60" w:themeColor="accent1" w:themeShade="7F"/>
     </w:rPr>
   </w:style>
-  <w:style w:type="character" w:customStyle="1" w:styleId="Heading7Char">
-    <w:name w:val="Heading 7 Char"/>
-    <w:basedOn w:val="DefaultParagraphFont"/>
-    <w:link w:val="Heading7"/>
+  <w:style w:type="character" w:customStyle="1" w:styleId="berschrift7Zchn">
+    <w:name w:val="Überschrift 7 Zchn"/>
+    <w:basedOn w:val="Absatz-Standardschriftart"/>
+    <w:link w:val="berschrift7"/>
     <w:uiPriority w:val="9"/>
     <w:semiHidden/>
     <w:rsid w:val="00FC693F"/>
@@ -11318,10 +11196,10 @@
       <w:color w:val="404040" w:themeColor="text1" w:themeTint="BF"/>
     </w:rPr>
   </w:style>
-  <w:style w:type="character" w:customStyle="1" w:styleId="Heading8Char">
-    <w:name w:val="Heading 8 Char"/>
-    <w:basedOn w:val="DefaultParagraphFont"/>
-    <w:link w:val="Heading8"/>
+  <w:style w:type="character" w:customStyle="1" w:styleId="berschrift8Zchn">
+    <w:name w:val="Überschrift 8 Zchn"/>
+    <w:basedOn w:val="Absatz-Standardschriftart"/>
+    <w:link w:val="berschrift8"/>
     <w:uiPriority w:val="9"/>
     <w:semiHidden/>
     <w:rsid w:val="00FC693F"/>
@@ -11332,10 +11210,10 @@
       <w:szCs w:val="20"/>
     </w:rPr>
   </w:style>
-  <w:style w:type="character" w:customStyle="1" w:styleId="Heading9Char">
-    <w:name w:val="Heading 9 Char"/>
-    <w:basedOn w:val="DefaultParagraphFont"/>
-    <w:link w:val="Heading9"/>
+  <w:style w:type="character" w:customStyle="1" w:styleId="berschrift9Zchn">
+    <w:name w:val="Überschrift 9 Zchn"/>
+    <w:basedOn w:val="Absatz-Standardschriftart"/>
+    <w:link w:val="berschrift9"/>
     <w:uiPriority w:val="9"/>
     <w:semiHidden/>
     <w:rsid w:val="00FC693F"/>
@@ -11348,10 +11226,10 @@
       <w:szCs w:val="20"/>
     </w:rPr>
   </w:style>
-  <w:style w:type="paragraph" w:styleId="Caption">
+  <w:style w:type="paragraph" w:styleId="Beschriftung">
     <w:name w:val="caption"/>
-    <w:basedOn w:val="Normal"/>
-    <w:next w:val="Normal"/>
+    <w:basedOn w:val="Standard"/>
+    <w:next w:val="Standard"/>
     <w:uiPriority w:val="35"/>
     <w:semiHidden/>
     <w:unhideWhenUsed/>
@@ -11368,9 +11246,9 @@
       <w:szCs w:val="18"/>
     </w:rPr>
   </w:style>
-  <w:style w:type="character" w:styleId="Strong">
+  <w:style w:type="character" w:styleId="Fett">
     <w:name w:val="Strong"/>
-    <w:basedOn w:val="DefaultParagraphFont"/>
+    <w:basedOn w:val="Absatz-Standardschriftart"/>
     <w:uiPriority w:val="22"/>
     <w:qFormat/>
     <w:rsid w:val="00FC693F"/>
@@ -11379,9 +11257,9 @@
       <w:bCs/>
     </w:rPr>
   </w:style>
-  <w:style w:type="character" w:styleId="Emphasis">
+  <w:style w:type="character" w:styleId="Hervorhebung">
     <w:name w:val="Emphasis"/>
-    <w:basedOn w:val="DefaultParagraphFont"/>
+    <w:basedOn w:val="Absatz-Standardschriftart"/>
     <w:uiPriority w:val="20"/>
     <w:qFormat/>
     <w:rsid w:val="00FC693F"/>
@@ -11390,11 +11268,11 @@
       <w:iCs/>
     </w:rPr>
   </w:style>
-  <w:style w:type="paragraph" w:styleId="IntenseQuote">
+  <w:style w:type="paragraph" w:styleId="IntensivesZitat">
     <w:name w:val="Intense Quote"/>
-    <w:basedOn w:val="Normal"/>
-    <w:next w:val="Normal"/>
-    <w:link w:val="IntenseQuoteChar"/>
+    <w:basedOn w:val="Standard"/>
+    <w:next w:val="Standard"/>
+    <w:link w:val="IntensivesZitatZchn"/>
     <w:uiPriority w:val="30"/>
     <w:qFormat/>
     <w:rsid w:val="00FC693F"/>
@@ -11413,10 +11291,10 @@
       <w:color w:val="4F81BD" w:themeColor="accent1"/>
     </w:rPr>
   </w:style>
-  <w:style w:type="character" w:customStyle="1" w:styleId="IntenseQuoteChar">
-    <w:name w:val="Intense Quote Char"/>
-    <w:basedOn w:val="DefaultParagraphFont"/>
-    <w:link w:val="IntenseQuote"/>
+  <w:style w:type="character" w:customStyle="1" w:styleId="IntensivesZitatZchn">
+    <w:name w:val="Intensives Zitat Zchn"/>
+    <w:basedOn w:val="Absatz-Standardschriftart"/>
+    <w:link w:val="IntensivesZitat"/>
     <w:uiPriority w:val="30"/>
     <w:rsid w:val="00FC693F"/>
     <w:rPr>
@@ -11427,9 +11305,9 @@
       <w:color w:val="4F81BD" w:themeColor="accent1"/>
     </w:rPr>
   </w:style>
-  <w:style w:type="character" w:styleId="SubtleEmphasis">
+  <w:style w:type="character" w:styleId="SchwacheHervorhebung">
     <w:name w:val="Subtle Emphasis"/>
-    <w:basedOn w:val="DefaultParagraphFont"/>
+    <w:basedOn w:val="Absatz-Standardschriftart"/>
     <w:uiPriority w:val="19"/>
     <w:qFormat/>
     <w:rsid w:val="00FC693F"/>
@@ -11439,9 +11317,9 @@
       <w:color w:val="808080" w:themeColor="text1" w:themeTint="7F"/>
     </w:rPr>
   </w:style>
-  <w:style w:type="character" w:styleId="IntenseEmphasis">
+  <w:style w:type="character" w:styleId="IntensiveHervorhebung">
     <w:name w:val="Intense Emphasis"/>
-    <w:basedOn w:val="DefaultParagraphFont"/>
+    <w:basedOn w:val="Absatz-Standardschriftart"/>
     <w:uiPriority w:val="21"/>
     <w:qFormat/>
     <w:rsid w:val="00FC693F"/>
@@ -11453,9 +11331,9 @@
       <w:color w:val="4F81BD" w:themeColor="accent1"/>
     </w:rPr>
   </w:style>
-  <w:style w:type="character" w:styleId="SubtleReference">
+  <w:style w:type="character" w:styleId="SchwacherVerweis">
     <w:name w:val="Subtle Reference"/>
-    <w:basedOn w:val="DefaultParagraphFont"/>
+    <w:basedOn w:val="Absatz-Standardschriftart"/>
     <w:uiPriority w:val="31"/>
     <w:qFormat/>
     <w:rsid w:val="00FC693F"/>
@@ -11465,9 +11343,9 @@
       <w:u w:val="single"/>
     </w:rPr>
   </w:style>
-  <w:style w:type="character" w:styleId="IntenseReference">
+  <w:style w:type="character" w:styleId="IntensiverVerweis">
     <w:name w:val="Intense Reference"/>
-    <w:basedOn w:val="DefaultParagraphFont"/>
+    <w:basedOn w:val="Absatz-Standardschriftart"/>
     <w:uiPriority w:val="32"/>
     <w:qFormat/>
     <w:rsid w:val="00FC693F"/>
@@ -11480,9 +11358,9 @@
       <w:u w:val="single"/>
     </w:rPr>
   </w:style>
-  <w:style w:type="character" w:styleId="BookTitle">
+  <w:style w:type="character" w:styleId="Buchtitel">
     <w:name w:val="Book Title"/>
-    <w:basedOn w:val="DefaultParagraphFont"/>
+    <w:basedOn w:val="Absatz-Standardschriftart"/>
     <w:uiPriority w:val="33"/>
     <w:qFormat/>
     <w:rsid w:val="00FC693F"/>
@@ -11493,10 +11371,10 @@
       <w:spacing w:val="5"/>
     </w:rPr>
   </w:style>
-  <w:style w:type="paragraph" w:styleId="TOCHeading">
+  <w:style w:type="paragraph" w:styleId="Inhaltsverzeichnisberschrift">
     <w:name w:val="TOC Heading"/>
-    <w:basedOn w:val="Heading1"/>
-    <w:next w:val="Normal"/>
+    <w:basedOn w:val="berschrift1"/>
+    <w:next w:val="Standard"/>
     <w:uiPriority w:val="39"/>
     <w:semiHidden/>
     <w:unhideWhenUsed/>
@@ -11506,9 +11384,9 @@
       <w:outlineLvl w:val="9"/>
     </w:pPr>
   </w:style>
-  <w:style w:type="table" w:styleId="TableGrid">
+  <w:style w:type="table" w:styleId="Tabellenraster">
     <w:name w:val="Table Grid"/>
-    <w:basedOn w:val="TableNormal"/>
+    <w:basedOn w:val="NormaleTabelle"/>
     <w:uiPriority w:val="59"/>
     <w:rsid w:val="00FC693F"/>
     <w:pPr>
@@ -11525,9 +11403,9 @@
       </w:tblBorders>
     </w:tblPr>
   </w:style>
-  <w:style w:type="table" w:styleId="LightShading">
+  <w:style w:type="table" w:styleId="HelleSchattierung">
     <w:name w:val="Light Shading"/>
-    <w:basedOn w:val="TableNormal"/>
+    <w:basedOn w:val="NormaleTabelle"/>
     <w:uiPriority w:val="60"/>
     <w:rsid w:val="00FC693F"/>
     <w:pPr>
@@ -11621,9 +11499,9 @@
       </w:tcPr>
     </w:tblStylePr>
   </w:style>
-  <w:style w:type="table" w:styleId="LightShading-Accent1">
+  <w:style w:type="table" w:styleId="HelleSchattierung-Akzent1">
     <w:name w:val="Light Shading Accent 1"/>
-    <w:basedOn w:val="TableNormal"/>
+    <w:basedOn w:val="NormaleTabelle"/>
     <w:uiPriority w:val="60"/>
     <w:rsid w:val="00FC693F"/>
     <w:pPr>
@@ -11717,9 +11595,9 @@
       </w:tcPr>
     </w:tblStylePr>
   </w:style>
-  <w:style w:type="table" w:styleId="LightShading-Accent2">
+  <w:style w:type="table" w:styleId="HelleSchattierung-Akzent2">
     <w:name w:val="Light Shading Accent 2"/>
-    <w:basedOn w:val="TableNormal"/>
+    <w:basedOn w:val="NormaleTabelle"/>
     <w:uiPriority w:val="60"/>
     <w:rsid w:val="00FC693F"/>
     <w:pPr>
@@ -11813,9 +11691,9 @@
       </w:tcPr>
     </w:tblStylePr>
   </w:style>
-  <w:style w:type="table" w:styleId="LightShading-Accent3">
+  <w:style w:type="table" w:styleId="HelleSchattierung-Akzent3">
     <w:name w:val="Light Shading Accent 3"/>
-    <w:basedOn w:val="TableNormal"/>
+    <w:basedOn w:val="NormaleTabelle"/>
     <w:uiPriority w:val="60"/>
     <w:rsid w:val="00FC693F"/>
     <w:pPr>
@@ -11909,9 +11787,9 @@
       </w:tcPr>
     </w:tblStylePr>
   </w:style>
-  <w:style w:type="table" w:styleId="LightShading-Accent4">
+  <w:style w:type="table" w:styleId="HelleSchattierung-Akzent4">
     <w:name w:val="Light Shading Accent 4"/>
-    <w:basedOn w:val="TableNormal"/>
+    <w:basedOn w:val="NormaleTabelle"/>
     <w:uiPriority w:val="60"/>
     <w:rsid w:val="00FC693F"/>
     <w:pPr>
@@ -12005,9 +11883,9 @@
       </w:tcPr>
     </w:tblStylePr>
   </w:style>
-  <w:style w:type="table" w:styleId="LightShading-Accent5">
+  <w:style w:type="table" w:styleId="HelleSchattierung-Akzent5">
     <w:name w:val="Light Shading Accent 5"/>
-    <w:basedOn w:val="TableNormal"/>
+    <w:basedOn w:val="NormaleTabelle"/>
     <w:uiPriority w:val="60"/>
     <w:rsid w:val="00FC693F"/>
     <w:pPr>
@@ -12101,9 +11979,9 @@
       </w:tcPr>
     </w:tblStylePr>
   </w:style>
-  <w:style w:type="table" w:styleId="LightShading-Accent6">
+  <w:style w:type="table" w:styleId="HelleSchattierung-Akzent6">
     <w:name w:val="Light Shading Accent 6"/>
-    <w:basedOn w:val="TableNormal"/>
+    <w:basedOn w:val="NormaleTabelle"/>
     <w:uiPriority w:val="60"/>
     <w:rsid w:val="00FC693F"/>
     <w:pPr>
@@ -12197,9 +12075,9 @@
       </w:tcPr>
     </w:tblStylePr>
   </w:style>
-  <w:style w:type="table" w:styleId="LightList">
+  <w:style w:type="table" w:styleId="HelleListe">
     <w:name w:val="Light List"/>
-    <w:basedOn w:val="TableNormal"/>
+    <w:basedOn w:val="NormaleTabelle"/>
     <w:uiPriority w:val="61"/>
     <w:rsid w:val="00FC693F"/>
     <w:pPr>
@@ -12282,9 +12160,9 @@
       </w:tcPr>
     </w:tblStylePr>
   </w:style>
-  <w:style w:type="table" w:styleId="LightList-Accent1">
+  <w:style w:type="table" w:styleId="HelleListe-Akzent1">
     <w:name w:val="Light List Accent 1"/>
-    <w:basedOn w:val="TableNormal"/>
+    <w:basedOn w:val="NormaleTabelle"/>
     <w:uiPriority w:val="61"/>
     <w:rsid w:val="00FC693F"/>
     <w:pPr>
@@ -12367,9 +12245,9 @@
       </w:tcPr>
     </w:tblStylePr>
   </w:style>
-  <w:style w:type="table" w:styleId="LightList-Accent2">
+  <w:style w:type="table" w:styleId="HelleListe-Akzent2">
     <w:name w:val="Light List Accent 2"/>
-    <w:basedOn w:val="TableNormal"/>
+    <w:basedOn w:val="NormaleTabelle"/>
     <w:uiPriority w:val="61"/>
     <w:rsid w:val="00CB0664"/>
     <w:pPr>
@@ -12452,9 +12330,9 @@
       </w:tcPr>
     </w:tblStylePr>
   </w:style>
-  <w:style w:type="table" w:styleId="LightList-Accent3">
+  <w:style w:type="table" w:styleId="HelleListe-Akzent3">
     <w:name w:val="Light List Accent 3"/>
-    <w:basedOn w:val="TableNormal"/>
+    <w:basedOn w:val="NormaleTabelle"/>
     <w:uiPriority w:val="61"/>
     <w:rsid w:val="00CB0664"/>
     <w:pPr>
@@ -12537,9 +12415,9 @@
       </w:tcPr>
     </w:tblStylePr>
   </w:style>
-  <w:style w:type="table" w:styleId="LightList-Accent4">
+  <w:style w:type="table" w:styleId="HelleListe-Akzent4">
     <w:name w:val="Light List Accent 4"/>
-    <w:basedOn w:val="TableNormal"/>
+    <w:basedOn w:val="NormaleTabelle"/>
     <w:uiPriority w:val="61"/>
     <w:rsid w:val="00CB0664"/>
     <w:pPr>
@@ -12622,9 +12500,9 @@
       </w:tcPr>
     </w:tblStylePr>
   </w:style>
-  <w:style w:type="table" w:styleId="LightList-Accent5">
+  <w:style w:type="table" w:styleId="HelleListe-Akzent5">
     <w:name w:val="Light List Accent 5"/>
-    <w:basedOn w:val="TableNormal"/>
+    <w:basedOn w:val="NormaleTabelle"/>
     <w:uiPriority w:val="61"/>
     <w:rsid w:val="00CB0664"/>
     <w:pPr>
@@ -12707,9 +12585,9 @@
       </w:tcPr>
     </w:tblStylePr>
   </w:style>
-  <w:style w:type="table" w:styleId="LightList-Accent6">
+  <w:style w:type="table" w:styleId="HelleListe-Akzent6">
     <w:name w:val="Light List Accent 6"/>
-    <w:basedOn w:val="TableNormal"/>
+    <w:basedOn w:val="NormaleTabelle"/>
     <w:uiPriority w:val="61"/>
     <w:rsid w:val="00CB0664"/>
     <w:pPr>
@@ -12792,9 +12670,9 @@
       </w:tcPr>
     </w:tblStylePr>
   </w:style>
-  <w:style w:type="table" w:styleId="LightGrid">
+  <w:style w:type="table" w:styleId="HellesRaster">
     <w:name w:val="Light Grid"/>
-    <w:basedOn w:val="TableNormal"/>
+    <w:basedOn w:val="NormaleTabelle"/>
     <w:uiPriority w:val="62"/>
     <w:rsid w:val="00CB0664"/>
     <w:pPr>
@@ -12915,9 +12793,9 @@
       </w:tcPr>
     </w:tblStylePr>
   </w:style>
-  <w:style w:type="table" w:styleId="LightGrid-Accent1">
+  <w:style w:type="table" w:styleId="HellesRaster-Akzent1">
     <w:name w:val="Light Grid Accent 1"/>
-    <w:basedOn w:val="TableNormal"/>
+    <w:basedOn w:val="NormaleTabelle"/>
     <w:uiPriority w:val="62"/>
     <w:rsid w:val="00CB0664"/>
     <w:pPr>
@@ -13038,9 +12916,9 @@
       </w:tcPr>
     </w:tblStylePr>
   </w:style>
-  <w:style w:type="table" w:styleId="LightGrid-Accent2">
+  <w:style w:type="table" w:styleId="HellesRaster-Akzent2">
     <w:name w:val="Light Grid Accent 2"/>
-    <w:basedOn w:val="TableNormal"/>
+    <w:basedOn w:val="NormaleTabelle"/>
     <w:uiPriority w:val="62"/>
     <w:rsid w:val="00CB0664"/>
     <w:pPr>
@@ -13161,9 +13039,9 @@
       </w:tcPr>
     </w:tblStylePr>
   </w:style>
-  <w:style w:type="table" w:styleId="LightGrid-Accent3">
+  <w:style w:type="table" w:styleId="HellesRaster-Akzent3">
     <w:name w:val="Light Grid Accent 3"/>
-    <w:basedOn w:val="TableNormal"/>
+    <w:basedOn w:val="NormaleTabelle"/>
     <w:uiPriority w:val="62"/>
     <w:rsid w:val="00CB0664"/>
     <w:pPr>
@@ -13284,9 +13162,9 @@
       </w:tcPr>
     </w:tblStylePr>
   </w:style>
-  <w:style w:type="table" w:styleId="LightGrid-Accent4">
+  <w:style w:type="table" w:styleId="HellesRaster-Akzent4">
     <w:name w:val="Light Grid Accent 4"/>
-    <w:basedOn w:val="TableNormal"/>
+    <w:basedOn w:val="NormaleTabelle"/>
     <w:uiPriority w:val="62"/>
     <w:rsid w:val="00CB0664"/>
     <w:pPr>
@@ -13407,9 +13285,9 @@
       </w:tcPr>
     </w:tblStylePr>
   </w:style>
-  <w:style w:type="table" w:styleId="LightGrid-Accent5">
+  <w:style w:type="table" w:styleId="HellesRaster-Akzent5">
     <w:name w:val="Light Grid Accent 5"/>
-    <w:basedOn w:val="TableNormal"/>
+    <w:basedOn w:val="NormaleTabelle"/>
     <w:uiPriority w:val="62"/>
     <w:rsid w:val="00CB0664"/>
     <w:pPr>
@@ -13530,9 +13408,9 @@
       </w:tcPr>
     </w:tblStylePr>
   </w:style>
-  <w:style w:type="table" w:styleId="LightGrid-Accent6">
+  <w:style w:type="table" w:styleId="HellesRaster-Akzent6">
     <w:name w:val="Light Grid Accent 6"/>
-    <w:basedOn w:val="TableNormal"/>
+    <w:basedOn w:val="NormaleTabelle"/>
     <w:uiPriority w:val="62"/>
     <w:rsid w:val="00CB0664"/>
     <w:pPr>
@@ -13653,9 +13531,9 @@
       </w:tcPr>
     </w:tblStylePr>
   </w:style>
-  <w:style w:type="table" w:styleId="MediumShading1">
+  <w:style w:type="table" w:styleId="MittlereSchattierung1">
     <w:name w:val="Medium Shading 1"/>
-    <w:basedOn w:val="TableNormal"/>
+    <w:basedOn w:val="NormaleTabelle"/>
     <w:uiPriority w:val="63"/>
     <w:rsid w:val="00CB0664"/>
     <w:pPr>
@@ -13752,9 +13630,9 @@
       </w:tcPr>
     </w:tblStylePr>
   </w:style>
-  <w:style w:type="table" w:styleId="MediumShading1-Accent1">
+  <w:style w:type="table" w:styleId="MittlereSchattierung1-Akzent1">
     <w:name w:val="Medium Shading 1 Accent 1"/>
-    <w:basedOn w:val="TableNormal"/>
+    <w:basedOn w:val="NormaleTabelle"/>
     <w:uiPriority w:val="63"/>
     <w:rsid w:val="00CB0664"/>
     <w:pPr>
@@ -13851,9 +13729,9 @@
       </w:tcPr>
     </w:tblStylePr>
   </w:style>
-  <w:style w:type="table" w:styleId="MediumShading1-Accent2">
+  <w:style w:type="table" w:styleId="MittlereSchattierung1-Akzent2">
     <w:name w:val="Medium Shading 1 Accent 2"/>
-    <w:basedOn w:val="TableNormal"/>
+    <w:basedOn w:val="NormaleTabelle"/>
     <w:uiPriority w:val="63"/>
     <w:rsid w:val="00CB0664"/>
     <w:pPr>
@@ -13950,9 +13828,9 @@
       </w:tcPr>
     </w:tblStylePr>
   </w:style>
-  <w:style w:type="table" w:styleId="MediumShading1-Accent3">
+  <w:style w:type="table" w:styleId="MittlereSchattierung1-Akzent3">
     <w:name w:val="Medium Shading 1 Accent 3"/>
-    <w:basedOn w:val="TableNormal"/>
+    <w:basedOn w:val="NormaleTabelle"/>
     <w:uiPriority w:val="63"/>
     <w:rsid w:val="00CB0664"/>
     <w:pPr>
@@ -14049,9 +13927,9 @@
       </w:tcPr>
     </w:tblStylePr>
   </w:style>
-  <w:style w:type="table" w:styleId="MediumShading1-Accent4">
+  <w:style w:type="table" w:styleId="MittlereSchattierung1-Akzent4">
     <w:name w:val="Medium Shading 1 Accent 4"/>
-    <w:basedOn w:val="TableNormal"/>
+    <w:basedOn w:val="NormaleTabelle"/>
     <w:uiPriority w:val="63"/>
     <w:rsid w:val="00CB0664"/>
     <w:pPr>
@@ -14148,9 +14026,9 @@
       </w:tcPr>
     </w:tblStylePr>
   </w:style>
-  <w:style w:type="table" w:styleId="MediumShading1-Accent5">
+  <w:style w:type="table" w:styleId="MittlereSchattierung1-Akzent5">
     <w:name w:val="Medium Shading 1 Accent 5"/>
-    <w:basedOn w:val="TableNormal"/>
+    <w:basedOn w:val="NormaleTabelle"/>
     <w:uiPriority w:val="63"/>
     <w:rsid w:val="00CB0664"/>
     <w:pPr>
@@ -14247,9 +14125,9 @@
       </w:tcPr>
     </w:tblStylePr>
   </w:style>
-  <w:style w:type="table" w:styleId="MediumShading1-Accent6">
+  <w:style w:type="table" w:styleId="MittlereSchattierung1-Akzent6">
     <w:name w:val="Medium Shading 1 Accent 6"/>
-    <w:basedOn w:val="TableNormal"/>
+    <w:basedOn w:val="NormaleTabelle"/>
     <w:uiPriority w:val="63"/>
     <w:rsid w:val="00CB0664"/>
     <w:pPr>
@@ -14346,9 +14224,9 @@
       </w:tcPr>
     </w:tblStylePr>
   </w:style>
-  <w:style w:type="table" w:styleId="MediumShading2">
+  <w:style w:type="table" w:styleId="MittlereSchattierung2">
     <w:name w:val="Medium Shading 2"/>
-    <w:basedOn w:val="TableNormal"/>
+    <w:basedOn w:val="NormaleTabelle"/>
     <w:uiPriority w:val="64"/>
     <w:rsid w:val="00CB0664"/>
     <w:pPr>
@@ -14488,9 +14366,9 @@
       </w:tcPr>
     </w:tblStylePr>
   </w:style>
-  <w:style w:type="table" w:styleId="MediumShading2-Accent1">
+  <w:style w:type="table" w:styleId="MittlereSchattierung2-Akzent1">
     <w:name w:val="Medium Shading 2 Accent 1"/>
-    <w:basedOn w:val="TableNormal"/>
+    <w:basedOn w:val="NormaleTabelle"/>
     <w:uiPriority w:val="64"/>
     <w:rsid w:val="00CB0664"/>
     <w:pPr>
@@ -14630,9 +14508,9 @@
       </w:tcPr>
     </w:tblStylePr>
   </w:style>
-  <w:style w:type="table" w:styleId="MediumShading2-Accent2">
+  <w:style w:type="table" w:styleId="MittlereSchattierung2-Akzent2">
     <w:name w:val="Medium Shading 2 Accent 2"/>
-    <w:basedOn w:val="TableNormal"/>
+    <w:basedOn w:val="NormaleTabelle"/>
     <w:uiPriority w:val="64"/>
     <w:rsid w:val="00CB0664"/>
     <w:pPr>
@@ -14772,9 +14650,9 @@
       </w:tcPr>
     </w:tblStylePr>
   </w:style>
-  <w:style w:type="table" w:styleId="MediumShading2-Accent3">
+  <w:style w:type="table" w:styleId="MittlereSchattierung2-Akzent3">
     <w:name w:val="Medium Shading 2 Accent 3"/>
-    <w:basedOn w:val="TableNormal"/>
+    <w:basedOn w:val="NormaleTabelle"/>
     <w:uiPriority w:val="64"/>
     <w:rsid w:val="00CB0664"/>
     <w:pPr>
@@ -14914,9 +14792,9 @@
       </w:tcPr>
     </w:tblStylePr>
   </w:style>
-  <w:style w:type="table" w:styleId="MediumShading2-Accent4">
+  <w:style w:type="table" w:styleId="MittlereSchattierung2-Akzent4">
     <w:name w:val="Medium Shading 2 Accent 4"/>
-    <w:basedOn w:val="TableNormal"/>
+    <w:basedOn w:val="NormaleTabelle"/>
     <w:uiPriority w:val="64"/>
     <w:rsid w:val="00CB0664"/>
     <w:pPr>
@@ -15056,9 +14934,9 @@
       </w:tcPr>
     </w:tblStylePr>
   </w:style>
-  <w:style w:type="table" w:styleId="MediumShading2-Accent5">
+  <w:style w:type="table" w:styleId="MittlereSchattierung2-Akzent5">
     <w:name w:val="Medium Shading 2 Accent 5"/>
-    <w:basedOn w:val="TableNormal"/>
+    <w:basedOn w:val="NormaleTabelle"/>
     <w:uiPriority w:val="64"/>
     <w:rsid w:val="00CB0664"/>
     <w:pPr>
@@ -15198,9 +15076,9 @@
       </w:tcPr>
     </w:tblStylePr>
   </w:style>
-  <w:style w:type="table" w:styleId="MediumShading2-Accent6">
+  <w:style w:type="table" w:styleId="MittlereSchattierung2-Akzent6">
     <w:name w:val="Medium Shading 2 Accent 6"/>
-    <w:basedOn w:val="TableNormal"/>
+    <w:basedOn w:val="NormaleTabelle"/>
     <w:uiPriority w:val="64"/>
     <w:rsid w:val="00CB0664"/>
     <w:pPr>
@@ -15340,9 +15218,9 @@
       </w:tcPr>
     </w:tblStylePr>
   </w:style>
-  <w:style w:type="table" w:styleId="MediumList1">
+  <w:style w:type="table" w:styleId="MittlereListe1">
     <w:name w:val="Medium List 1"/>
-    <w:basedOn w:val="TableNormal"/>
+    <w:basedOn w:val="NormaleTabelle"/>
     <w:uiPriority w:val="65"/>
     <w:rsid w:val="00CB0664"/>
     <w:pPr>
@@ -15417,9 +15295,9 @@
       </w:tcPr>
     </w:tblStylePr>
   </w:style>
-  <w:style w:type="table" w:styleId="MediumList1-Accent1">
+  <w:style w:type="table" w:styleId="MittlereListe1-Akzent1">
     <w:name w:val="Medium List 1 Accent 1"/>
-    <w:basedOn w:val="TableNormal"/>
+    <w:basedOn w:val="NormaleTabelle"/>
     <w:uiPriority w:val="65"/>
     <w:rsid w:val="00CB0664"/>
     <w:pPr>
@@ -15494,9 +15372,9 @@
       </w:tcPr>
     </w:tblStylePr>
   </w:style>
-  <w:style w:type="table" w:styleId="MediumList1-Accent2">
+  <w:style w:type="table" w:styleId="MittlereListe1-Akzent2">
     <w:name w:val="Medium List 1 Accent 2"/>
-    <w:basedOn w:val="TableNormal"/>
+    <w:basedOn w:val="NormaleTabelle"/>
     <w:uiPriority w:val="65"/>
     <w:rsid w:val="00CB0664"/>
     <w:pPr>
@@ -15571,9 +15449,9 @@
       </w:tcPr>
     </w:tblStylePr>
   </w:style>
-  <w:style w:type="table" w:styleId="MediumList1-Accent3">
+  <w:style w:type="table" w:styleId="MittlereListe1-Akzent3">
     <w:name w:val="Medium List 1 Accent 3"/>
-    <w:basedOn w:val="TableNormal"/>
+    <w:basedOn w:val="NormaleTabelle"/>
     <w:uiPriority w:val="65"/>
     <w:rsid w:val="00CB0664"/>
     <w:pPr>
@@ -15648,9 +15526,9 @@
       </w:tcPr>
     </w:tblStylePr>
   </w:style>
-  <w:style w:type="table" w:styleId="MediumList1-Accent4">
+  <w:style w:type="table" w:styleId="MittlereListe1-Akzent4">
     <w:name w:val="Medium List 1 Accent 4"/>
-    <w:basedOn w:val="TableNormal"/>
+    <w:basedOn w:val="NormaleTabelle"/>
     <w:uiPriority w:val="65"/>
     <w:rsid w:val="00CB0664"/>
     <w:pPr>
@@ -15725,9 +15603,9 @@
       </w:tcPr>
     </w:tblStylePr>
   </w:style>
-  <w:style w:type="table" w:styleId="MediumList1-Accent5">
+  <w:style w:type="table" w:styleId="MittlereListe1-Akzent5">
     <w:name w:val="Medium List 1 Accent 5"/>
-    <w:basedOn w:val="TableNormal"/>
+    <w:basedOn w:val="NormaleTabelle"/>
     <w:uiPriority w:val="65"/>
     <w:rsid w:val="00CB0664"/>
     <w:pPr>
@@ -15802,9 +15680,9 @@
       </w:tcPr>
     </w:tblStylePr>
   </w:style>
-  <w:style w:type="table" w:styleId="MediumList1-Accent6">
+  <w:style w:type="table" w:styleId="MittlereListe1-Akzent6">
     <w:name w:val="Medium List 1 Accent 6"/>
-    <w:basedOn w:val="TableNormal"/>
+    <w:basedOn w:val="NormaleTabelle"/>
     <w:uiPriority w:val="65"/>
     <w:rsid w:val="00CB0664"/>
     <w:pPr>
@@ -15879,9 +15757,9 @@
       </w:tcPr>
     </w:tblStylePr>
   </w:style>
-  <w:style w:type="table" w:styleId="MediumList2">
+  <w:style w:type="table" w:styleId="MittlereListe2">
     <w:name w:val="Medium List 2"/>
-    <w:basedOn w:val="TableNormal"/>
+    <w:basedOn w:val="NormaleTabelle"/>
     <w:uiPriority w:val="66"/>
     <w:rsid w:val="00CB0664"/>
     <w:pPr>
@@ -16000,9 +15878,9 @@
       </w:tcPr>
     </w:tblStylePr>
   </w:style>
-  <w:style w:type="table" w:styleId="MediumList2-Accent1">
+  <w:style w:type="table" w:styleId="MittlereListe2-Akzent1">
     <w:name w:val="Medium List 2 Accent 1"/>
-    <w:basedOn w:val="TableNormal"/>
+    <w:basedOn w:val="NormaleTabelle"/>
     <w:uiPriority w:val="66"/>
     <w:rsid w:val="00CB0664"/>
     <w:pPr>
@@ -16121,9 +15999,9 @@
       </w:tcPr>
     </w:tblStylePr>
   </w:style>
-  <w:style w:type="table" w:styleId="MediumList2-Accent2">
+  <w:style w:type="table" w:styleId="MittlereListe2-Akzent2">
     <w:name w:val="Medium List 2 Accent 2"/>
-    <w:basedOn w:val="TableNormal"/>
+    <w:basedOn w:val="NormaleTabelle"/>
     <w:uiPriority w:val="66"/>
     <w:rsid w:val="00CB0664"/>
     <w:pPr>
@@ -16242,9 +16120,9 @@
       </w:tcPr>
     </w:tblStylePr>
   </w:style>
-  <w:style w:type="table" w:styleId="MediumList2-Accent3">
+  <w:style w:type="table" w:styleId="MittlereListe2-Akzent3">
     <w:name w:val="Medium List 2 Accent 3"/>
-    <w:basedOn w:val="TableNormal"/>
+    <w:basedOn w:val="NormaleTabelle"/>
     <w:uiPriority w:val="66"/>
     <w:rsid w:val="00CB0664"/>
     <w:pPr>
@@ -16363,9 +16241,9 @@
       </w:tcPr>
     </w:tblStylePr>
   </w:style>
-  <w:style w:type="table" w:styleId="MediumList2-Accent4">
+  <w:style w:type="table" w:styleId="MittlereListe2-Akzent4">
     <w:name w:val="Medium List 2 Accent 4"/>
-    <w:basedOn w:val="TableNormal"/>
+    <w:basedOn w:val="NormaleTabelle"/>
     <w:uiPriority w:val="66"/>
     <w:rsid w:val="00CB0664"/>
     <w:pPr>
@@ -16484,9 +16362,9 @@
       </w:tcPr>
     </w:tblStylePr>
   </w:style>
-  <w:style w:type="table" w:styleId="MediumList2-Accent5">
+  <w:style w:type="table" w:styleId="MittlereListe2-Akzent5">
     <w:name w:val="Medium List 2 Accent 5"/>
-    <w:basedOn w:val="TableNormal"/>
+    <w:basedOn w:val="NormaleTabelle"/>
     <w:uiPriority w:val="66"/>
     <w:rsid w:val="00CB0664"/>
     <w:pPr>
@@ -16605,9 +16483,9 @@
       </w:tcPr>
     </w:tblStylePr>
   </w:style>
-  <w:style w:type="table" w:styleId="MediumList2-Accent6">
+  <w:style w:type="table" w:styleId="MittlereListe2-Akzent6">
     <w:name w:val="Medium List 2 Accent 6"/>
-    <w:basedOn w:val="TableNormal"/>
+    <w:basedOn w:val="NormaleTabelle"/>
     <w:uiPriority w:val="66"/>
     <w:rsid w:val="00CB0664"/>
     <w:pPr>
@@ -16726,9 +16604,9 @@
       </w:tcPr>
     </w:tblStylePr>
   </w:style>
-  <w:style w:type="table" w:styleId="MediumGrid1">
+  <w:style w:type="table" w:styleId="MittleresRaster1">
     <w:name w:val="Medium Grid 1"/>
-    <w:basedOn w:val="TableNormal"/>
+    <w:basedOn w:val="NormaleTabelle"/>
     <w:uiPriority w:val="67"/>
     <w:rsid w:val="00CB0664"/>
     <w:pPr>
@@ -16792,9 +16670,9 @@
       </w:tcPr>
     </w:tblStylePr>
   </w:style>
-  <w:style w:type="table" w:styleId="MediumGrid1-Accent1">
+  <w:style w:type="table" w:styleId="MittleresRaster1-Akzent1">
     <w:name w:val="Medium Grid 1 Accent 1"/>
-    <w:basedOn w:val="TableNormal"/>
+    <w:basedOn w:val="NormaleTabelle"/>
     <w:uiPriority w:val="67"/>
     <w:rsid w:val="00CB0664"/>
     <w:pPr>
@@ -16858,9 +16736,9 @@
       </w:tcPr>
     </w:tblStylePr>
   </w:style>
-  <w:style w:type="table" w:styleId="MediumGrid1-Accent2">
+  <w:style w:type="table" w:styleId="MittleresRaster1-Akzent2">
     <w:name w:val="Medium Grid 1 Accent 2"/>
-    <w:basedOn w:val="TableNormal"/>
+    <w:basedOn w:val="NormaleTabelle"/>
     <w:uiPriority w:val="67"/>
     <w:rsid w:val="00CB0664"/>
     <w:pPr>
@@ -16924,9 +16802,9 @@
       </w:tcPr>
     </w:tblStylePr>
   </w:style>
-  <w:style w:type="table" w:styleId="MediumGrid1-Accent3">
+  <w:style w:type="table" w:styleId="MittleresRaster1-Akzent3">
     <w:name w:val="Medium Grid 1 Accent 3"/>
-    <w:basedOn w:val="TableNormal"/>
+    <w:basedOn w:val="NormaleTabelle"/>
     <w:uiPriority w:val="67"/>
     <w:rsid w:val="00CB0664"/>
     <w:pPr>
@@ -16990,9 +16868,9 @@
       </w:tcPr>
     </w:tblStylePr>
   </w:style>
-  <w:style w:type="table" w:styleId="MediumGrid1-Accent4">
+  <w:style w:type="table" w:styleId="MittleresRaster1-Akzent4">
     <w:name w:val="Medium Grid 1 Accent 4"/>
-    <w:basedOn w:val="TableNormal"/>
+    <w:basedOn w:val="NormaleTabelle"/>
     <w:uiPriority w:val="67"/>
     <w:rsid w:val="00CB0664"/>
     <w:pPr>
@@ -17056,9 +16934,9 @@
       </w:tcPr>
     </w:tblStylePr>
   </w:style>
-  <w:style w:type="table" w:styleId="MediumGrid1-Accent5">
+  <w:style w:type="table" w:styleId="MittleresRaster1-Akzent5">
     <w:name w:val="Medium Grid 1 Accent 5"/>
-    <w:basedOn w:val="TableNormal"/>
+    <w:basedOn w:val="NormaleTabelle"/>
     <w:uiPriority w:val="67"/>
     <w:rsid w:val="00CB0664"/>
     <w:pPr>
@@ -17122,9 +17000,9 @@
       </w:tcPr>
     </w:tblStylePr>
   </w:style>
-  <w:style w:type="table" w:styleId="MediumGrid1-Accent6">
+  <w:style w:type="table" w:styleId="MittleresRaster1-Akzent6">
     <w:name w:val="Medium Grid 1 Accent 6"/>
-    <w:basedOn w:val="TableNormal"/>
+    <w:basedOn w:val="NormaleTabelle"/>
     <w:uiPriority w:val="67"/>
     <w:rsid w:val="00CB0664"/>
     <w:pPr>
@@ -17188,9 +17066,9 @@
       </w:tcPr>
     </w:tblStylePr>
   </w:style>
-  <w:style w:type="table" w:styleId="MediumGrid2">
+  <w:style w:type="table" w:styleId="MittleresRaster2">
     <w:name w:val="Medium Grid 2"/>
-    <w:basedOn w:val="TableNormal"/>
+    <w:basedOn w:val="NormaleTabelle"/>
     <w:uiPriority w:val="68"/>
     <w:rsid w:val="00CB0664"/>
     <w:pPr>
@@ -17306,9 +17184,9 @@
       </w:tcPr>
     </w:tblStylePr>
   </w:style>
-  <w:style w:type="table" w:styleId="MediumGrid2-Accent1">
+  <w:style w:type="table" w:styleId="MittleresRaster2-Akzent1">
     <w:name w:val="Medium Grid 2 Accent 1"/>
-    <w:basedOn w:val="TableNormal"/>
+    <w:basedOn w:val="NormaleTabelle"/>
     <w:uiPriority w:val="68"/>
     <w:rsid w:val="00CB0664"/>
     <w:pPr>
@@ -17424,9 +17302,9 @@
       </w:tcPr>
     </w:tblStylePr>
   </w:style>
-  <w:style w:type="table" w:styleId="MediumGrid2-Accent2">
+  <w:style w:type="table" w:styleId="MittleresRaster2-Akzent2">
     <w:name w:val="Medium Grid 2 Accent 2"/>
-    <w:basedOn w:val="TableNormal"/>
+    <w:basedOn w:val="NormaleTabelle"/>
     <w:uiPriority w:val="68"/>
     <w:rsid w:val="00CB0664"/>
     <w:pPr>
@@ -17542,9 +17420,9 @@
       </w:tcPr>
     </w:tblStylePr>
   </w:style>
-  <w:style w:type="table" w:styleId="MediumGrid2-Accent3">
+  <w:style w:type="table" w:styleId="MittleresRaster2-Akzent3">
     <w:name w:val="Medium Grid 2 Accent 3"/>
-    <w:basedOn w:val="TableNormal"/>
+    <w:basedOn w:val="NormaleTabelle"/>
     <w:uiPriority w:val="68"/>
     <w:rsid w:val="00CB0664"/>
     <w:pPr>
@@ -17660,9 +17538,9 @@
       </w:tcPr>
     </w:tblStylePr>
   </w:style>
-  <w:style w:type="table" w:styleId="MediumGrid2-Accent4">
+  <w:style w:type="table" w:styleId="MittleresRaster2-Akzent4">
     <w:name w:val="Medium Grid 2 Accent 4"/>
-    <w:basedOn w:val="TableNormal"/>
+    <w:basedOn w:val="NormaleTabelle"/>
     <w:uiPriority w:val="68"/>
     <w:rsid w:val="00CB0664"/>
     <w:pPr>
@@ -17778,9 +17656,9 @@
       </w:tcPr>
     </w:tblStylePr>
   </w:style>
-  <w:style w:type="table" w:styleId="MediumGrid2-Accent5">
+  <w:style w:type="table" w:styleId="MittleresRaster2-Akzent5">
     <w:name w:val="Medium Grid 2 Accent 5"/>
-    <w:basedOn w:val="TableNormal"/>
+    <w:basedOn w:val="NormaleTabelle"/>
     <w:uiPriority w:val="68"/>
     <w:rsid w:val="00CB0664"/>
     <w:pPr>
@@ -17896,9 +17774,9 @@
       </w:tcPr>
     </w:tblStylePr>
   </w:style>
-  <w:style w:type="table" w:styleId="MediumGrid2-Accent6">
+  <w:style w:type="table" w:styleId="MittleresRaster2-Akzent6">
     <w:name w:val="Medium Grid 2 Accent 6"/>
-    <w:basedOn w:val="TableNormal"/>
+    <w:basedOn w:val="NormaleTabelle"/>
     <w:uiPriority w:val="68"/>
     <w:rsid w:val="00CB0664"/>
     <w:pPr>
@@ -18014,9 +17892,9 @@
       </w:tcPr>
     </w:tblStylePr>
   </w:style>
-  <w:style w:type="table" w:styleId="MediumGrid3">
+  <w:style w:type="table" w:styleId="MittleresRaster3">
     <w:name w:val="Medium Grid 3"/>
-    <w:basedOn w:val="TableNormal"/>
+    <w:basedOn w:val="NormaleTabelle"/>
     <w:uiPriority w:val="69"/>
     <w:rsid w:val="00CB0664"/>
     <w:pPr>
@@ -18148,9 +18026,9 @@
       </w:tcPr>
     </w:tblStylePr>
   </w:style>
-  <w:style w:type="table" w:styleId="MediumGrid3-Accent1">
+  <w:style w:type="table" w:styleId="MittleresRaster3-Akzent1">
     <w:name w:val="Medium Grid 3 Accent 1"/>
-    <w:basedOn w:val="TableNormal"/>
+    <w:basedOn w:val="NormaleTabelle"/>
     <w:uiPriority w:val="69"/>
     <w:rsid w:val="00CB0664"/>
     <w:pPr>
@@ -18282,9 +18160,9 @@
       </w:tcPr>
     </w:tblStylePr>
   </w:style>
-  <w:style w:type="table" w:styleId="MediumGrid3-Accent2">
+  <w:style w:type="table" w:styleId="MittleresRaster3-Akzent2">
     <w:name w:val="Medium Grid 3 Accent 2"/>
-    <w:basedOn w:val="TableNormal"/>
+    <w:basedOn w:val="NormaleTabelle"/>
     <w:uiPriority w:val="69"/>
     <w:rsid w:val="00CB0664"/>
     <w:pPr>
@@ -18416,9 +18294,9 @@
       </w:tcPr>
     </w:tblStylePr>
   </w:style>
-  <w:style w:type="table" w:styleId="MediumGrid3-Accent3">
+  <w:style w:type="table" w:styleId="MittleresRaster3-Akzent3">
     <w:name w:val="Medium Grid 3 Accent 3"/>
-    <w:basedOn w:val="TableNormal"/>
+    <w:basedOn w:val="NormaleTabelle"/>
     <w:uiPriority w:val="69"/>
     <w:rsid w:val="00CB0664"/>
     <w:pPr>
@@ -18550,9 +18428,9 @@
       </w:tcPr>
     </w:tblStylePr>
   </w:style>
-  <w:style w:type="table" w:styleId="MediumGrid3-Accent4">
+  <w:style w:type="table" w:styleId="MittleresRaster3-Akzent4">
     <w:name w:val="Medium Grid 3 Accent 4"/>
-    <w:basedOn w:val="TableNormal"/>
+    <w:basedOn w:val="NormaleTabelle"/>
     <w:uiPriority w:val="69"/>
     <w:rsid w:val="00CB0664"/>
     <w:pPr>
@@ -18684,9 +18562,9 @@
       </w:tcPr>
     </w:tblStylePr>
   </w:style>
-  <w:style w:type="table" w:styleId="MediumGrid3-Accent5">
+  <w:style w:type="table" w:styleId="MittleresRaster3-Akzent5">
     <w:name w:val="Medium Grid 3 Accent 5"/>
-    <w:basedOn w:val="TableNormal"/>
+    <w:basedOn w:val="NormaleTabelle"/>
     <w:uiPriority w:val="69"/>
     <w:rsid w:val="00CB0664"/>
     <w:pPr>
@@ -18818,9 +18696,9 @@
       </w:tcPr>
     </w:tblStylePr>
   </w:style>
-  <w:style w:type="table" w:styleId="MediumGrid3-Accent6">
+  <w:style w:type="table" w:styleId="MittleresRaster3-Akzent6">
     <w:name w:val="Medium Grid 3 Accent 6"/>
-    <w:basedOn w:val="TableNormal"/>
+    <w:basedOn w:val="NormaleTabelle"/>
     <w:uiPriority w:val="69"/>
     <w:rsid w:val="00CB0664"/>
     <w:pPr>
@@ -18952,9 +18830,9 @@
       </w:tcPr>
     </w:tblStylePr>
   </w:style>
-  <w:style w:type="table" w:styleId="DarkList">
+  <w:style w:type="table" w:styleId="DunkleListe">
     <w:name w:val="Dark List"/>
-    <w:basedOn w:val="TableNormal"/>
+    <w:basedOn w:val="NormaleTabelle"/>
     <w:uiPriority w:val="70"/>
     <w:rsid w:val="00CB0664"/>
     <w:pPr>
@@ -19059,9 +18937,9 @@
       </w:tcPr>
     </w:tblStylePr>
   </w:style>
-  <w:style w:type="table" w:styleId="DarkList-Accent1">
+  <w:style w:type="table" w:styleId="DunkleListe-Akzent1">
     <w:name w:val="Dark List Accent 1"/>
-    <w:basedOn w:val="TableNormal"/>
+    <w:basedOn w:val="NormaleTabelle"/>
     <w:uiPriority w:val="70"/>
     <w:rsid w:val="00CB0664"/>
     <w:pPr>
@@ -19166,9 +19044,9 @@
       </w:tcPr>
     </w:tblStylePr>
   </w:style>
-  <w:style w:type="table" w:styleId="DarkList-Accent2">
+  <w:style w:type="table" w:styleId="DunkleListe-Akzent2">
     <w:name w:val="Dark List Accent 2"/>
-    <w:basedOn w:val="TableNormal"/>
+    <w:basedOn w:val="NormaleTabelle"/>
     <w:uiPriority w:val="70"/>
     <w:rsid w:val="00CB0664"/>
     <w:pPr>
@@ -19273,9 +19151,9 @@
       </w:tcPr>
     </w:tblStylePr>
   </w:style>
-  <w:style w:type="table" w:styleId="DarkList-Accent3">
+  <w:style w:type="table" w:styleId="DunkleListe-Akzent3">
     <w:name w:val="Dark List Accent 3"/>
-    <w:basedOn w:val="TableNormal"/>
+    <w:basedOn w:val="NormaleTabelle"/>
     <w:uiPriority w:val="70"/>
     <w:rsid w:val="00CB0664"/>
     <w:pPr>
@@ -19380,9 +19258,9 @@
       </w:tcPr>
     </w:tblStylePr>
   </w:style>
-  <w:style w:type="table" w:styleId="DarkList-Accent4">
+  <w:style w:type="table" w:styleId="DunkleListe-Akzent4">
     <w:name w:val="Dark List Accent 4"/>
-    <w:basedOn w:val="TableNormal"/>
+    <w:basedOn w:val="NormaleTabelle"/>
     <w:uiPriority w:val="70"/>
     <w:rsid w:val="00CB0664"/>
     <w:pPr>
@@ -19487,9 +19365,9 @@
       </w:tcPr>
     </w:tblStylePr>
   </w:style>
-  <w:style w:type="table" w:styleId="DarkList-Accent5">
+  <w:style w:type="table" w:styleId="DunkleListe-Akzent5">
     <w:name w:val="Dark List Accent 5"/>
-    <w:basedOn w:val="TableNormal"/>
+    <w:basedOn w:val="NormaleTabelle"/>
     <w:uiPriority w:val="70"/>
     <w:rsid w:val="00CB0664"/>
     <w:pPr>
@@ -19594,9 +19472,9 @@
       </w:tcPr>
     </w:tblStylePr>
   </w:style>
-  <w:style w:type="table" w:styleId="DarkList-Accent6">
+  <w:style w:type="table" w:styleId="DunkleListe-Akzent6">
     <w:name w:val="Dark List Accent 6"/>
-    <w:basedOn w:val="TableNormal"/>
+    <w:basedOn w:val="NormaleTabelle"/>
     <w:uiPriority w:val="70"/>
     <w:rsid w:val="00CB0664"/>
     <w:pPr>
@@ -19701,9 +19579,9 @@
       </w:tcPr>
     </w:tblStylePr>
   </w:style>
-  <w:style w:type="table" w:styleId="ColourfulShading">
+  <w:style w:type="table" w:styleId="FarbigeSchattierung">
     <w:name w:val="Colorful Shading"/>
-    <w:basedOn w:val="TableNormal"/>
+    <w:basedOn w:val="NormaleTabelle"/>
     <w:uiPriority w:val="71"/>
     <w:rsid w:val="00CB0664"/>
     <w:pPr>
@@ -19816,9 +19694,9 @@
       </w:rPr>
     </w:tblStylePr>
   </w:style>
-  <w:style w:type="table" w:styleId="ColourfulShadingAccent1">
+  <w:style w:type="table" w:styleId="FarbigeSchattierung-Akzent1">
     <w:name w:val="Colorful Shading Accent 1"/>
-    <w:basedOn w:val="TableNormal"/>
+    <w:basedOn w:val="NormaleTabelle"/>
     <w:uiPriority w:val="71"/>
     <w:rsid w:val="00CB0664"/>
     <w:pPr>
@@ -19931,9 +19809,9 @@
       </w:rPr>
     </w:tblStylePr>
   </w:style>
-  <w:style w:type="table" w:styleId="ColourfulShadingAccent2">
+  <w:style w:type="table" w:styleId="FarbigeSchattierung-Akzent2">
     <w:name w:val="Colorful Shading Accent 2"/>
-    <w:basedOn w:val="TableNormal"/>
+    <w:basedOn w:val="NormaleTabelle"/>
     <w:uiPriority w:val="71"/>
     <w:rsid w:val="00CB0664"/>
     <w:pPr>
@@ -20046,9 +19924,9 @@
       </w:rPr>
     </w:tblStylePr>
   </w:style>
-  <w:style w:type="table" w:styleId="ColourfulShadingAccent3">
+  <w:style w:type="table" w:styleId="FarbigeSchattierung-Akzent3">
     <w:name w:val="Colorful Shading Accent 3"/>
-    <w:basedOn w:val="TableNormal"/>
+    <w:basedOn w:val="NormaleTabelle"/>
     <w:uiPriority w:val="71"/>
     <w:rsid w:val="00CB0664"/>
     <w:pPr>
@@ -20151,9 +20029,9 @@
       </w:tcPr>
     </w:tblStylePr>
   </w:style>
-  <w:style w:type="table" w:styleId="ColourfulShadingAccent4">
+  <w:style w:type="table" w:styleId="FarbigeSchattierung-Akzent4">
     <w:name w:val="Colorful Shading Accent 4"/>
-    <w:basedOn w:val="TableNormal"/>
+    <w:basedOn w:val="NormaleTabelle"/>
     <w:uiPriority w:val="71"/>
     <w:rsid w:val="00CB0664"/>
     <w:pPr>
@@ -20266,9 +20144,9 @@
       </w:rPr>
     </w:tblStylePr>
   </w:style>
-  <w:style w:type="table" w:styleId="ColourfulShadingAccent5">
+  <w:style w:type="table" w:styleId="FarbigeSchattierung-Akzent5">
     <w:name w:val="Colorful Shading Accent 5"/>
-    <w:basedOn w:val="TableNormal"/>
+    <w:basedOn w:val="NormaleTabelle"/>
     <w:uiPriority w:val="71"/>
     <w:rsid w:val="00CB0664"/>
     <w:pPr>
@@ -20381,9 +20259,9 @@
       </w:rPr>
     </w:tblStylePr>
   </w:style>
-  <w:style w:type="table" w:styleId="ColourfulShadingAccent6">
+  <w:style w:type="table" w:styleId="FarbigeSchattierung-Akzent6">
     <w:name w:val="Colorful Shading Accent 6"/>
-    <w:basedOn w:val="TableNormal"/>
+    <w:basedOn w:val="NormaleTabelle"/>
     <w:uiPriority w:val="71"/>
     <w:rsid w:val="00CB0664"/>
     <w:pPr>
@@ -20496,9 +20374,9 @@
       </w:rPr>
     </w:tblStylePr>
   </w:style>
-  <w:style w:type="table" w:styleId="ColourfulList">
+  <w:style w:type="table" w:styleId="FarbigeListe">
     <w:name w:val="Colorful List"/>
-    <w:basedOn w:val="TableNormal"/>
+    <w:basedOn w:val="NormaleTabelle"/>
     <w:uiPriority w:val="72"/>
     <w:rsid w:val="00CB0664"/>
     <w:pPr>
@@ -20575,9 +20453,9 @@
       </w:tcPr>
     </w:tblStylePr>
   </w:style>
-  <w:style w:type="table" w:styleId="ColourfulListAccent1">
+  <w:style w:type="table" w:styleId="FarbigeListe-Akzent1">
     <w:name w:val="Colorful List Accent 1"/>
-    <w:basedOn w:val="TableNormal"/>
+    <w:basedOn w:val="NormaleTabelle"/>
     <w:uiPriority w:val="72"/>
     <w:rsid w:val="00CB0664"/>
     <w:pPr>
@@ -20654,9 +20532,9 @@
       </w:tcPr>
     </w:tblStylePr>
   </w:style>
-  <w:style w:type="table" w:styleId="ColourfulListAccent2">
+  <w:style w:type="table" w:styleId="FarbigeListe-Akzent2">
     <w:name w:val="Colorful List Accent 2"/>
-    <w:basedOn w:val="TableNormal"/>
+    <w:basedOn w:val="NormaleTabelle"/>
     <w:uiPriority w:val="72"/>
     <w:rsid w:val="00CB0664"/>
     <w:pPr>
@@ -20733,9 +20611,9 @@
       </w:tcPr>
     </w:tblStylePr>
   </w:style>
-  <w:style w:type="table" w:styleId="ColourfulListAccent3">
+  <w:style w:type="table" w:styleId="FarbigeListe-Akzent3">
     <w:name w:val="Colorful List Accent 3"/>
-    <w:basedOn w:val="TableNormal"/>
+    <w:basedOn w:val="NormaleTabelle"/>
     <w:uiPriority w:val="72"/>
     <w:rsid w:val="00CB0664"/>
     <w:pPr>
@@ -20812,9 +20690,9 @@
       </w:tcPr>
     </w:tblStylePr>
   </w:style>
-  <w:style w:type="table" w:styleId="ColourfulListAccent4">
+  <w:style w:type="table" w:styleId="FarbigeListe-Akzent4">
     <w:name w:val="Colorful List Accent 4"/>
-    <w:basedOn w:val="TableNormal"/>
+    <w:basedOn w:val="NormaleTabelle"/>
     <w:uiPriority w:val="72"/>
     <w:rsid w:val="00CB0664"/>
     <w:pPr>
@@ -20891,9 +20769,9 @@
       </w:tcPr>
     </w:tblStylePr>
   </w:style>
-  <w:style w:type="table" w:styleId="ColourfulListAccent5">
+  <w:style w:type="table" w:styleId="FarbigeListe-Akzent5">
     <w:name w:val="Colorful List Accent 5"/>
-    <w:basedOn w:val="TableNormal"/>
+    <w:basedOn w:val="NormaleTabelle"/>
     <w:uiPriority w:val="72"/>
     <w:rsid w:val="00CB0664"/>
     <w:pPr>
@@ -20970,9 +20848,9 @@
       </w:tcPr>
     </w:tblStylePr>
   </w:style>
-  <w:style w:type="table" w:styleId="ColourfulListAccent6">
+  <w:style w:type="table" w:styleId="FarbigeListe-Akzent6">
     <w:name w:val="Colorful List Accent 6"/>
-    <w:basedOn w:val="TableNormal"/>
+    <w:basedOn w:val="NormaleTabelle"/>
     <w:uiPriority w:val="72"/>
     <w:rsid w:val="00CB0664"/>
     <w:pPr>
@@ -21049,9 +20927,9 @@
       </w:tcPr>
     </w:tblStylePr>
   </w:style>
-  <w:style w:type="table" w:styleId="ColourfulGrid">
+  <w:style w:type="table" w:styleId="FarbigesRaster">
     <w:name w:val="Colorful Grid"/>
-    <w:basedOn w:val="TableNormal"/>
+    <w:basedOn w:val="NormaleTabelle"/>
     <w:uiPriority w:val="73"/>
     <w:rsid w:val="00CB0664"/>
     <w:pPr>
@@ -21122,9 +21000,9 @@
       </w:tcPr>
     </w:tblStylePr>
   </w:style>
-  <w:style w:type="table" w:styleId="ColourfulGridAccent1">
+  <w:style w:type="table" w:styleId="FarbigesRaster-Akzent1">
     <w:name w:val="Colorful Grid Accent 1"/>
-    <w:basedOn w:val="TableNormal"/>
+    <w:basedOn w:val="NormaleTabelle"/>
     <w:uiPriority w:val="73"/>
     <w:rsid w:val="00CB0664"/>
     <w:pPr>
@@ -21195,9 +21073,9 @@
       </w:tcPr>
     </w:tblStylePr>
   </w:style>
-  <w:style w:type="table" w:styleId="ColourfulGridAccent2">
+  <w:style w:type="table" w:styleId="FarbigesRaster-Akzent2">
     <w:name w:val="Colorful Grid Accent 2"/>
-    <w:basedOn w:val="TableNormal"/>
+    <w:basedOn w:val="NormaleTabelle"/>
     <w:uiPriority w:val="73"/>
     <w:rsid w:val="00CB0664"/>
     <w:pPr>
@@ -21268,9 +21146,9 @@
       </w:tcPr>
     </w:tblStylePr>
   </w:style>
-  <w:style w:type="table" w:styleId="ColourfulGridAccent3">
+  <w:style w:type="table" w:styleId="FarbigesRaster-Akzent3">
     <w:name w:val="Colorful Grid Accent 3"/>
-    <w:basedOn w:val="TableNormal"/>
+    <w:basedOn w:val="NormaleTabelle"/>
     <w:uiPriority w:val="73"/>
     <w:rsid w:val="00CB0664"/>
     <w:pPr>
@@ -21341,9 +21219,9 @@
       </w:tcPr>
     </w:tblStylePr>
   </w:style>
-  <w:style w:type="table" w:styleId="ColourfulGridAccent4">
+  <w:style w:type="table" w:styleId="FarbigesRaster-Akzent4">
     <w:name w:val="Colorful Grid Accent 4"/>
-    <w:basedOn w:val="TableNormal"/>
+    <w:basedOn w:val="NormaleTabelle"/>
     <w:uiPriority w:val="73"/>
     <w:rsid w:val="00CB0664"/>
     <w:pPr>
@@ -21414,9 +21292,9 @@
       </w:tcPr>
     </w:tblStylePr>
   </w:style>
-  <w:style w:type="table" w:styleId="ColourfulGridAccent5">
+  <w:style w:type="table" w:styleId="FarbigesRaster-Akzent5">
     <w:name w:val="Colorful Grid Accent 5"/>
-    <w:basedOn w:val="TableNormal"/>
+    <w:basedOn w:val="NormaleTabelle"/>
     <w:uiPriority w:val="73"/>
     <w:rsid w:val="00CB0664"/>
     <w:pPr>
@@ -21487,9 +21365,9 @@
       </w:tcPr>
     </w:tblStylePr>
   </w:style>
-  <w:style w:type="table" w:styleId="ColourfulGridAccent6">
+  <w:style w:type="table" w:styleId="FarbigesRaster-Akzent6">
     <w:name w:val="Colorful Grid Accent 6"/>
-    <w:basedOn w:val="TableNormal"/>
+    <w:basedOn w:val="NormaleTabelle"/>
     <w:uiPriority w:val="73"/>
     <w:rsid w:val="00CB0664"/>
     <w:pPr>

</xml_diff>